<commit_message>
Finish report for lab9exam
</commit_message>
<xml_diff>
--- a/docs/Activity Report.docx
+++ b/docs/Activity Report.docx
@@ -89,12 +89,6 @@
         <w:gridCol w:w="2340"/>
       </w:tblGrid>
       <w:tr>
-        <w:tblPrEx>
-          <w:tblCellMar>
-            <w:top w:w="0" w:type="dxa"/>
-            <w:bottom w:w="0" w:type="dxa"/>
-          </w:tblCellMar>
-        </w:tblPrEx>
         <w:tc>
           <w:tcPr>
             <w:tcW w:w="2340" w:type="dxa"/>
@@ -116,7 +110,11 @@
           <w:tcPr>
             <w:tcW w:w="2340" w:type="dxa"/>
           </w:tcPr>
-          <w:p/>
+          <w:p>
+            <w:r>
+              <w:t>Antonio Messina</w:t>
+            </w:r>
+          </w:p>
         </w:tc>
         <w:tc>
           <w:tcPr>
@@ -139,7 +137,11 @@
           <w:tcPr>
             <w:tcW w:w="2340" w:type="dxa"/>
           </w:tcPr>
-          <w:p/>
+          <w:p>
+            <w:r>
+              <w:t>INFN</w:t>
+            </w:r>
+          </w:p>
         </w:tc>
       </w:tr>
     </w:tbl>
@@ -171,15 +173,59 @@
         </w:rPr>
       </w:pPr>
       <w:r>
-        <w:rPr>
-          <w:i/>
-          <w:iCs/>
-          <w:color w:val="808080"/>
-          <w:sz w:val="20"/>
-          <w:szCs w:val="20"/>
-          <w:lang w:val="en-US"/>
-        </w:rPr>
-        <w:t>Write the title of today's experimental activity.</w:t>
+        <w:t xml:space="preserve">Making a firmware </w:t>
+      </w:r>
+      <w:proofErr w:type="spellStart"/>
+      <w:r>
+        <w:t>that</w:t>
+      </w:r>
+      <w:proofErr w:type="spellEnd"/>
+      <w:r>
+        <w:t xml:space="preserve"> </w:t>
+      </w:r>
+      <w:proofErr w:type="spellStart"/>
+      <w:r>
+        <w:t>implement</w:t>
+      </w:r>
+      <w:proofErr w:type="spellEnd"/>
+      <w:r>
+        <w:t xml:space="preserve"> a</w:t>
+      </w:r>
+      <w:r>
+        <w:t xml:space="preserve"> Pulse </w:t>
+      </w:r>
+      <w:proofErr w:type="spellStart"/>
+      <w:r>
+        <w:t>Shape</w:t>
+      </w:r>
+      <w:proofErr w:type="spellEnd"/>
+      <w:r>
+        <w:t xml:space="preserve"> </w:t>
+      </w:r>
+      <w:proofErr w:type="spellStart"/>
+      <w:r>
+        <w:t>Discrimination</w:t>
+      </w:r>
+      <w:proofErr w:type="spellEnd"/>
+      <w:r>
+        <w:t xml:space="preserve"> (PSD) on the CAEN </w:t>
+      </w:r>
+      <w:r>
+        <w:t>SCDIK board</w:t>
+      </w:r>
+      <w:r>
+        <w:t xml:space="preserve">, </w:t>
+      </w:r>
+      <w:proofErr w:type="spellStart"/>
+      <w:r>
+        <w:t>using</w:t>
+      </w:r>
+      <w:proofErr w:type="spellEnd"/>
+      <w:r>
+        <w:t xml:space="preserve"> Sci-Compiler</w:t>
+      </w:r>
+      <w:r>
+        <w:t>.</w:t>
       </w:r>
     </w:p>
     <w:p>
@@ -225,68 +271,500 @@
     </w:p>
     <w:p>
       <w:pPr>
-        <w:spacing w:after="160"/>
-        <w:rPr>
-          <w:lang w:val="en-US"/>
-        </w:rPr>
-      </w:pPr>
-      <w:r>
-        <w:rPr>
-          <w:i/>
-          <w:iCs/>
-          <w:color w:val="808080"/>
-          <w:sz w:val="20"/>
-          <w:szCs w:val="20"/>
-          <w:lang w:val="en-US"/>
-        </w:rPr>
-        <w:t xml:space="preserve">Briefly </w:t>
-      </w:r>
-      <w:proofErr w:type="spellStart"/>
-      <w:r>
-        <w:rPr>
-          <w:i/>
-          <w:iCs/>
-          <w:color w:val="808080"/>
-          <w:sz w:val="20"/>
-          <w:szCs w:val="20"/>
-          <w:lang w:val="en-US"/>
-        </w:rPr>
-        <w:t>summarise</w:t>
-      </w:r>
-      <w:proofErr w:type="spellEnd"/>
-      <w:r>
-        <w:rPr>
-          <w:i/>
-          <w:iCs/>
-          <w:color w:val="808080"/>
-          <w:sz w:val="20"/>
-          <w:szCs w:val="20"/>
-          <w:lang w:val="en-US"/>
-        </w:rPr>
-        <w:t xml:space="preserve"> the experiment in 3–5 sentences: what you did, how, and what you found.</w:t>
-      </w:r>
-    </w:p>
-    <w:p>
-      <w:pPr>
         <w:pBdr>
           <w:bottom w:val="single" w:sz="6" w:space="0" w:color="BFBFBF"/>
         </w:pBdr>
         <w:spacing w:after="160"/>
-        <w:rPr>
-          <w:lang w:val="en-US"/>
-        </w:rPr>
-      </w:pPr>
-    </w:p>
-    <w:p>
-      <w:pPr>
-        <w:pBdr>
-          <w:bottom w:val="single" w:sz="6" w:space="0" w:color="BFBFBF"/>
-        </w:pBdr>
-        <w:spacing w:after="160"/>
-        <w:rPr>
-          <w:lang w:val="en-US"/>
-        </w:rPr>
-      </w:pPr>
+      </w:pPr>
+      <w:r>
+        <w:t xml:space="preserve">During the </w:t>
+      </w:r>
+      <w:proofErr w:type="spellStart"/>
+      <w:r>
+        <w:t>practical</w:t>
+      </w:r>
+      <w:proofErr w:type="spellEnd"/>
+      <w:r>
+        <w:t xml:space="preserve"> session, </w:t>
+      </w:r>
+      <w:proofErr w:type="spellStart"/>
+      <w:r>
+        <w:t>we</w:t>
+      </w:r>
+      <w:proofErr w:type="spellEnd"/>
+      <w:r>
+        <w:t xml:space="preserve"> </w:t>
+      </w:r>
+      <w:proofErr w:type="spellStart"/>
+      <w:r>
+        <w:t>developed</w:t>
+      </w:r>
+      <w:proofErr w:type="spellEnd"/>
+      <w:r>
+        <w:t xml:space="preserve"> a P</w:t>
+      </w:r>
+      <w:r>
+        <w:t xml:space="preserve">ulse </w:t>
+      </w:r>
+      <w:proofErr w:type="spellStart"/>
+      <w:r>
+        <w:t>Shape</w:t>
+      </w:r>
+      <w:proofErr w:type="spellEnd"/>
+      <w:r>
+        <w:t xml:space="preserve"> </w:t>
+      </w:r>
+      <w:proofErr w:type="spellStart"/>
+      <w:r>
+        <w:t>Discrimination</w:t>
+      </w:r>
+      <w:proofErr w:type="spellEnd"/>
+      <w:r>
+        <w:t xml:space="preserve"> (PSD)</w:t>
+      </w:r>
+      <w:r>
+        <w:t xml:space="preserve"> </w:t>
+      </w:r>
+      <w:proofErr w:type="spellStart"/>
+      <w:r>
+        <w:t>using</w:t>
+      </w:r>
+      <w:proofErr w:type="spellEnd"/>
+      <w:r>
+        <w:t xml:space="preserve"> Sci-Compiler</w:t>
+      </w:r>
+      <w:r>
+        <w:t xml:space="preserve">. </w:t>
+      </w:r>
+      <w:proofErr w:type="spellStart"/>
+      <w:r>
+        <w:t>This</w:t>
+      </w:r>
+      <w:proofErr w:type="spellEnd"/>
+      <w:r>
+        <w:t xml:space="preserve"> technique </w:t>
+      </w:r>
+      <w:proofErr w:type="spellStart"/>
+      <w:r>
+        <w:t>uses</w:t>
+      </w:r>
+      <w:proofErr w:type="spellEnd"/>
+      <w:r>
+        <w:t xml:space="preserve"> the ratio </w:t>
+      </w:r>
+      <w:proofErr w:type="spellStart"/>
+      <w:r>
+        <w:t>between</w:t>
+      </w:r>
+      <w:proofErr w:type="spellEnd"/>
+      <w:r>
+        <w:t xml:space="preserve"> the </w:t>
+      </w:r>
+      <w:proofErr w:type="spellStart"/>
+      <w:r>
+        <w:t>peak</w:t>
+      </w:r>
+      <w:proofErr w:type="spellEnd"/>
+      <w:r>
+        <w:t xml:space="preserve"> </w:t>
+      </w:r>
+      <w:proofErr w:type="spellStart"/>
+      <w:r>
+        <w:t>amplitude</w:t>
+      </w:r>
+      <w:proofErr w:type="spellEnd"/>
+      <w:r>
+        <w:t xml:space="preserve"> and the </w:t>
+      </w:r>
+      <w:proofErr w:type="spellStart"/>
+      <w:r>
+        <w:t>integrated</w:t>
+      </w:r>
+      <w:proofErr w:type="spellEnd"/>
+      <w:r>
+        <w:t xml:space="preserve"> </w:t>
+      </w:r>
+      <w:proofErr w:type="spellStart"/>
+      <w:r>
+        <w:t>charge</w:t>
+      </w:r>
+      <w:proofErr w:type="spellEnd"/>
+      <w:r>
+        <w:t xml:space="preserve"> (</w:t>
+      </w:r>
+      <w:proofErr w:type="spellStart"/>
+      <w:r>
+        <w:t>peak</w:t>
+      </w:r>
+      <w:proofErr w:type="spellEnd"/>
+      <w:r>
+        <w:t>/</w:t>
+      </w:r>
+      <w:proofErr w:type="spellStart"/>
+      <w:r>
+        <w:t>Qshort</w:t>
+      </w:r>
+      <w:proofErr w:type="spellEnd"/>
+      <w:r>
+        <w:t>).</w:t>
+      </w:r>
+      <w:r>
+        <w:t xml:space="preserve"> </w:t>
+      </w:r>
+      <w:r>
+        <w:t xml:space="preserve">Test </w:t>
+      </w:r>
+      <w:proofErr w:type="spellStart"/>
+      <w:r>
+        <w:t>signals</w:t>
+      </w:r>
+      <w:proofErr w:type="spellEnd"/>
+      <w:r>
+        <w:t xml:space="preserve"> </w:t>
+      </w:r>
+      <w:proofErr w:type="spellStart"/>
+      <w:r>
+        <w:t>were</w:t>
+      </w:r>
+      <w:proofErr w:type="spellEnd"/>
+      <w:r>
+        <w:t xml:space="preserve"> made with a </w:t>
+      </w:r>
+      <w:proofErr w:type="spellStart"/>
+      <w:r>
+        <w:t>digital</w:t>
+      </w:r>
+      <w:proofErr w:type="spellEnd"/>
+      <w:r>
+        <w:t xml:space="preserve"> detector emulator (CAEN DT5810</w:t>
+      </w:r>
+      <w:r>
+        <w:t xml:space="preserve">). </w:t>
+      </w:r>
+      <w:proofErr w:type="spellStart"/>
+      <w:r>
+        <w:t>This</w:t>
+      </w:r>
+      <w:proofErr w:type="spellEnd"/>
+      <w:r>
+        <w:t xml:space="preserve"> device </w:t>
+      </w:r>
+      <w:proofErr w:type="spellStart"/>
+      <w:r>
+        <w:t>let</w:t>
+      </w:r>
+      <w:proofErr w:type="spellEnd"/>
+      <w:r>
+        <w:t xml:space="preserve"> </w:t>
+      </w:r>
+      <w:proofErr w:type="spellStart"/>
+      <w:r>
+        <w:t>us</w:t>
+      </w:r>
+      <w:proofErr w:type="spellEnd"/>
+      <w:r>
+        <w:t xml:space="preserve"> </w:t>
+      </w:r>
+      <w:r>
+        <w:t>produce</w:t>
+      </w:r>
+      <w:r>
+        <w:t xml:space="preserve"> </w:t>
+      </w:r>
+      <w:proofErr w:type="spellStart"/>
+      <w:r>
+        <w:t>two</w:t>
+      </w:r>
+      <w:proofErr w:type="spellEnd"/>
+      <w:r>
+        <w:t xml:space="preserve"> </w:t>
+      </w:r>
+      <w:proofErr w:type="spellStart"/>
+      <w:r>
+        <w:t>artificial</w:t>
+      </w:r>
+      <w:proofErr w:type="spellEnd"/>
+      <w:r>
+        <w:t xml:space="preserve"> </w:t>
+      </w:r>
+      <w:proofErr w:type="spellStart"/>
+      <w:r>
+        <w:t>populations</w:t>
+      </w:r>
+      <w:proofErr w:type="spellEnd"/>
+      <w:r>
+        <w:t xml:space="preserve"> of </w:t>
+      </w:r>
+      <w:proofErr w:type="spellStart"/>
+      <w:r>
+        <w:t>pulses</w:t>
+      </w:r>
+      <w:proofErr w:type="spellEnd"/>
+      <w:r>
+        <w:t xml:space="preserve"> with </w:t>
+      </w:r>
+      <w:proofErr w:type="spellStart"/>
+      <w:r>
+        <w:t>different</w:t>
+      </w:r>
+      <w:proofErr w:type="spellEnd"/>
+      <w:r>
+        <w:t xml:space="preserve"> </w:t>
+      </w:r>
+      <w:proofErr w:type="spellStart"/>
+      <w:r>
+        <w:t>waveforms</w:t>
+      </w:r>
+      <w:proofErr w:type="spellEnd"/>
+      <w:r>
+        <w:t>: one like "</w:t>
+      </w:r>
+      <w:proofErr w:type="spellStart"/>
+      <w:r>
+        <w:t>neutron</w:t>
+      </w:r>
+      <w:proofErr w:type="spellEnd"/>
+      <w:r>
+        <w:t>" events (slow</w:t>
+      </w:r>
+      <w:r>
+        <w:t xml:space="preserve">) </w:t>
+      </w:r>
+      <w:r>
+        <w:t xml:space="preserve">and </w:t>
+      </w:r>
+      <w:proofErr w:type="spellStart"/>
+      <w:r>
+        <w:t>another</w:t>
+      </w:r>
+      <w:proofErr w:type="spellEnd"/>
+      <w:r>
+        <w:t xml:space="preserve"> </w:t>
+      </w:r>
+      <w:proofErr w:type="spellStart"/>
+      <w:r>
+        <w:t>population</w:t>
+      </w:r>
+      <w:proofErr w:type="spellEnd"/>
+      <w:r>
+        <w:t xml:space="preserve"> like "gamma" events (fast. </w:t>
+      </w:r>
+      <w:proofErr w:type="spellStart"/>
+      <w:r>
+        <w:t>We</w:t>
+      </w:r>
+      <w:proofErr w:type="spellEnd"/>
+      <w:r>
+        <w:t xml:space="preserve"> </w:t>
+      </w:r>
+      <w:proofErr w:type="spellStart"/>
+      <w:r>
+        <w:t>collected</w:t>
+      </w:r>
+      <w:proofErr w:type="spellEnd"/>
+      <w:r>
+        <w:t xml:space="preserve"> data for 2000 buffer </w:t>
+      </w:r>
+      <w:proofErr w:type="spellStart"/>
+      <w:r>
+        <w:t>read</w:t>
+      </w:r>
+      <w:proofErr w:type="spellEnd"/>
+      <w:r>
+        <w:t xml:space="preserve"> </w:t>
+      </w:r>
+      <w:proofErr w:type="spellStart"/>
+      <w:r>
+        <w:t>cycles</w:t>
+      </w:r>
+      <w:proofErr w:type="spellEnd"/>
+      <w:r>
+        <w:t xml:space="preserve">, with a trigger </w:t>
+      </w:r>
+      <w:proofErr w:type="spellStart"/>
+      <w:r>
+        <w:t>threshold</w:t>
+      </w:r>
+      <w:proofErr w:type="spellEnd"/>
+      <w:r>
+        <w:t xml:space="preserve"> of 45 ADC </w:t>
+      </w:r>
+      <w:proofErr w:type="spellStart"/>
+      <w:r>
+        <w:t>counts</w:t>
+      </w:r>
+      <w:proofErr w:type="spellEnd"/>
+      <w:r>
+        <w:t xml:space="preserve">, and </w:t>
+      </w:r>
+      <w:proofErr w:type="spellStart"/>
+      <w:r>
+        <w:t>got</w:t>
+      </w:r>
+      <w:proofErr w:type="spellEnd"/>
+      <w:r>
+        <w:t xml:space="preserve"> more </w:t>
+      </w:r>
+      <w:proofErr w:type="spellStart"/>
+      <w:r>
+        <w:t>than</w:t>
+      </w:r>
+      <w:proofErr w:type="spellEnd"/>
+      <w:r>
+        <w:t xml:space="preserve"> one </w:t>
+      </w:r>
+      <w:proofErr w:type="spellStart"/>
+      <w:r>
+        <w:t>million</w:t>
+      </w:r>
+      <w:proofErr w:type="spellEnd"/>
+      <w:r>
+        <w:t xml:space="preserve"> events. </w:t>
+      </w:r>
+      <w:proofErr w:type="spellStart"/>
+      <w:r>
+        <w:t>We</w:t>
+      </w:r>
+      <w:proofErr w:type="spellEnd"/>
+      <w:r>
+        <w:t xml:space="preserve"> </w:t>
+      </w:r>
+      <w:proofErr w:type="spellStart"/>
+      <w:r>
+        <w:t>analyzed</w:t>
+      </w:r>
+      <w:proofErr w:type="spellEnd"/>
+      <w:r>
+        <w:t xml:space="preserve"> the data offline in Python, making the energy </w:t>
+      </w:r>
+      <w:proofErr w:type="spellStart"/>
+      <w:r>
+        <w:t>spectrum</w:t>
+      </w:r>
+      <w:proofErr w:type="spellEnd"/>
+      <w:r>
+        <w:t xml:space="preserve"> and the PSD vs Energy plot. </w:t>
+      </w:r>
+      <w:proofErr w:type="spellStart"/>
+      <w:r>
+        <w:t>This</w:t>
+      </w:r>
+      <w:proofErr w:type="spellEnd"/>
+      <w:r>
+        <w:t xml:space="preserve"> last plot shows </w:t>
+      </w:r>
+      <w:proofErr w:type="spellStart"/>
+      <w:r>
+        <w:t>two</w:t>
+      </w:r>
+      <w:proofErr w:type="spellEnd"/>
+      <w:r>
+        <w:t xml:space="preserve"> </w:t>
+      </w:r>
+      <w:proofErr w:type="spellStart"/>
+      <w:r>
+        <w:t>bands</w:t>
+      </w:r>
+      <w:proofErr w:type="spellEnd"/>
+      <w:r>
+        <w:t xml:space="preserve"> </w:t>
+      </w:r>
+      <w:proofErr w:type="spellStart"/>
+      <w:r>
+        <w:t>very</w:t>
+      </w:r>
+      <w:proofErr w:type="spellEnd"/>
+      <w:r>
+        <w:t xml:space="preserve"> </w:t>
+      </w:r>
+      <w:proofErr w:type="spellStart"/>
+      <w:r>
+        <w:t>well</w:t>
+      </w:r>
+      <w:proofErr w:type="spellEnd"/>
+      <w:r>
+        <w:t xml:space="preserve"> </w:t>
+      </w:r>
+      <w:proofErr w:type="spellStart"/>
+      <w:r>
+        <w:t>separated</w:t>
+      </w:r>
+      <w:proofErr w:type="spellEnd"/>
+      <w:r>
+        <w:t xml:space="preserve">, </w:t>
+      </w:r>
+      <w:proofErr w:type="spellStart"/>
+      <w:r>
+        <w:t>that</w:t>
+      </w:r>
+      <w:proofErr w:type="spellEnd"/>
+      <w:r>
+        <w:t xml:space="preserve"> match with the </w:t>
+      </w:r>
+      <w:proofErr w:type="spellStart"/>
+      <w:r>
+        <w:t>two</w:t>
+      </w:r>
+      <w:proofErr w:type="spellEnd"/>
+      <w:r>
+        <w:t xml:space="preserve"> </w:t>
+      </w:r>
+      <w:proofErr w:type="spellStart"/>
+      <w:r>
+        <w:t>artificial</w:t>
+      </w:r>
+      <w:proofErr w:type="spellEnd"/>
+      <w:r>
+        <w:t xml:space="preserve"> </w:t>
+      </w:r>
+      <w:proofErr w:type="spellStart"/>
+      <w:r>
+        <w:t>populations</w:t>
+      </w:r>
+      <w:proofErr w:type="spellEnd"/>
+      <w:r>
+        <w:t xml:space="preserve"> </w:t>
+      </w:r>
+      <w:proofErr w:type="spellStart"/>
+      <w:r>
+        <w:t>we</w:t>
+      </w:r>
+      <w:proofErr w:type="spellEnd"/>
+      <w:r>
+        <w:t xml:space="preserve"> made. </w:t>
+      </w:r>
+      <w:proofErr w:type="spellStart"/>
+      <w:r>
+        <w:t>This</w:t>
+      </w:r>
+      <w:proofErr w:type="spellEnd"/>
+      <w:r>
+        <w:t xml:space="preserve"> shows </w:t>
+      </w:r>
+      <w:proofErr w:type="spellStart"/>
+      <w:r>
+        <w:t>that</w:t>
+      </w:r>
+      <w:proofErr w:type="spellEnd"/>
+      <w:r>
+        <w:t xml:space="preserve"> the </w:t>
+      </w:r>
+      <w:proofErr w:type="spellStart"/>
+      <w:r>
+        <w:t>algorithm</w:t>
+      </w:r>
+      <w:proofErr w:type="spellEnd"/>
+      <w:r>
+        <w:t xml:space="preserve"> works </w:t>
+      </w:r>
+      <w:proofErr w:type="spellStart"/>
+      <w:r>
+        <w:t>well</w:t>
+      </w:r>
+      <w:proofErr w:type="spellEnd"/>
+      <w:r>
+        <w:t>.</w:t>
+      </w:r>
     </w:p>
     <w:p>
       <w:pPr>
@@ -342,44 +820,635 @@
     </w:p>
     <w:p>
       <w:pPr>
-        <w:spacing w:after="160"/>
-        <w:rPr>
-          <w:lang w:val="en-US"/>
-        </w:rPr>
-      </w:pPr>
-      <w:r>
-        <w:rPr>
-          <w:i/>
-          <w:iCs/>
-          <w:color w:val="808080"/>
-          <w:sz w:val="20"/>
-          <w:szCs w:val="20"/>
-          <w:lang w:val="en-US"/>
-        </w:rPr>
-        <w:t>What is the aim of this experiment? What do you expect to observe or measure?</w:t>
-      </w:r>
-    </w:p>
-    <w:p>
-      <w:pPr>
         <w:pBdr>
           <w:bottom w:val="single" w:sz="6" w:space="0" w:color="BFBFBF"/>
         </w:pBdr>
         <w:spacing w:after="160"/>
-        <w:rPr>
-          <w:lang w:val="en-US"/>
-        </w:rPr>
-      </w:pPr>
+      </w:pPr>
+      <w:r>
+        <w:t xml:space="preserve">The </w:t>
+      </w:r>
+      <w:proofErr w:type="spellStart"/>
+      <w:r>
+        <w:t>purpose</w:t>
+      </w:r>
+      <w:proofErr w:type="spellEnd"/>
+      <w:r>
+        <w:t xml:space="preserve"> of </w:t>
+      </w:r>
+      <w:proofErr w:type="spellStart"/>
+      <w:r>
+        <w:t>this</w:t>
+      </w:r>
+      <w:proofErr w:type="spellEnd"/>
+      <w:r>
+        <w:t xml:space="preserve"> </w:t>
+      </w:r>
+      <w:proofErr w:type="spellStart"/>
+      <w:r>
+        <w:t>experiment</w:t>
+      </w:r>
+      <w:proofErr w:type="spellEnd"/>
+      <w:r>
+        <w:t xml:space="preserve"> </w:t>
+      </w:r>
+      <w:proofErr w:type="spellStart"/>
+      <w:r>
+        <w:t>is</w:t>
+      </w:r>
+      <w:proofErr w:type="spellEnd"/>
+      <w:r>
+        <w:t xml:space="preserve"> to make, with the Sci-Compiler graphic tool, </w:t>
+      </w:r>
+      <w:r>
+        <w:t xml:space="preserve">a </w:t>
+      </w:r>
+      <w:r>
+        <w:t xml:space="preserve">Pulse </w:t>
+      </w:r>
+      <w:proofErr w:type="spellStart"/>
+      <w:r>
+        <w:t>Shape</w:t>
+      </w:r>
+      <w:proofErr w:type="spellEnd"/>
+      <w:r>
+        <w:t xml:space="preserve"> </w:t>
+      </w:r>
+      <w:proofErr w:type="spellStart"/>
+      <w:r>
+        <w:t>Discrimination</w:t>
+      </w:r>
+      <w:proofErr w:type="spellEnd"/>
+      <w:r>
+        <w:t xml:space="preserve">. </w:t>
+      </w:r>
+      <w:proofErr w:type="spellStart"/>
+      <w:r>
+        <w:t>This</w:t>
+      </w:r>
+      <w:proofErr w:type="spellEnd"/>
+      <w:r>
+        <w:t xml:space="preserve"> technique </w:t>
+      </w:r>
+      <w:proofErr w:type="spellStart"/>
+      <w:r>
+        <w:t>uses</w:t>
+      </w:r>
+      <w:proofErr w:type="spellEnd"/>
+      <w:r>
+        <w:t xml:space="preserve"> the ratio </w:t>
+      </w:r>
+      <w:proofErr w:type="spellStart"/>
+      <w:r>
+        <w:t>between</w:t>
+      </w:r>
+      <w:proofErr w:type="spellEnd"/>
+      <w:r>
+        <w:t xml:space="preserve"> the area (</w:t>
+      </w:r>
+      <w:proofErr w:type="spellStart"/>
+      <w:r>
+        <w:t>integrated</w:t>
+      </w:r>
+      <w:proofErr w:type="spellEnd"/>
+      <w:r>
+        <w:t xml:space="preserve"> </w:t>
+      </w:r>
+      <w:proofErr w:type="spellStart"/>
+      <w:r>
+        <w:t>charge</w:t>
+      </w:r>
+      <w:proofErr w:type="spellEnd"/>
+      <w:r>
+        <w:t xml:space="preserve">) and the </w:t>
+      </w:r>
+      <w:proofErr w:type="spellStart"/>
+      <w:r>
+        <w:t>peak</w:t>
+      </w:r>
+      <w:proofErr w:type="spellEnd"/>
+      <w:r>
+        <w:t xml:space="preserve"> </w:t>
+      </w:r>
+      <w:proofErr w:type="spellStart"/>
+      <w:r>
+        <w:t>amplitude</w:t>
+      </w:r>
+      <w:proofErr w:type="spellEnd"/>
+      <w:r>
+        <w:t xml:space="preserve"> of the </w:t>
+      </w:r>
+      <w:proofErr w:type="spellStart"/>
+      <w:r>
+        <w:t>pulse</w:t>
+      </w:r>
+      <w:proofErr w:type="spellEnd"/>
+      <w:r>
+        <w:t xml:space="preserve">. Even </w:t>
+      </w:r>
+      <w:proofErr w:type="spellStart"/>
+      <w:r>
+        <w:t>if</w:t>
+      </w:r>
+      <w:proofErr w:type="spellEnd"/>
+      <w:r>
+        <w:t xml:space="preserve"> </w:t>
+      </w:r>
+      <w:proofErr w:type="spellStart"/>
+      <w:r>
+        <w:t>it</w:t>
+      </w:r>
+      <w:proofErr w:type="spellEnd"/>
+      <w:r>
+        <w:t xml:space="preserve"> </w:t>
+      </w:r>
+      <w:proofErr w:type="spellStart"/>
+      <w:r>
+        <w:t>is</w:t>
+      </w:r>
+      <w:proofErr w:type="spellEnd"/>
+      <w:r>
+        <w:t xml:space="preserve"> the </w:t>
+      </w:r>
+      <w:proofErr w:type="spellStart"/>
+      <w:r>
+        <w:t>simplest</w:t>
+      </w:r>
+      <w:proofErr w:type="spellEnd"/>
+      <w:r>
+        <w:t xml:space="preserve"> technique, </w:t>
+      </w:r>
+      <w:proofErr w:type="spellStart"/>
+      <w:r>
+        <w:t>it</w:t>
+      </w:r>
+      <w:proofErr w:type="spellEnd"/>
+      <w:r>
+        <w:t xml:space="preserve"> </w:t>
+      </w:r>
+      <w:proofErr w:type="spellStart"/>
+      <w:r>
+        <w:t>is</w:t>
+      </w:r>
+      <w:proofErr w:type="spellEnd"/>
+      <w:r>
+        <w:t xml:space="preserve"> the </w:t>
+      </w:r>
+      <w:proofErr w:type="spellStart"/>
+      <w:r>
+        <w:t>most</w:t>
+      </w:r>
+      <w:proofErr w:type="spellEnd"/>
+      <w:r>
+        <w:t xml:space="preserve"> </w:t>
+      </w:r>
+      <w:proofErr w:type="spellStart"/>
+      <w:r>
+        <w:t>used</w:t>
+      </w:r>
+      <w:proofErr w:type="spellEnd"/>
+      <w:r>
+        <w:t xml:space="preserve"> one, </w:t>
+      </w:r>
+      <w:proofErr w:type="spellStart"/>
+      <w:r>
+        <w:t>because</w:t>
+      </w:r>
+      <w:proofErr w:type="spellEnd"/>
+      <w:r>
+        <w:t xml:space="preserve"> </w:t>
+      </w:r>
+      <w:proofErr w:type="spellStart"/>
+      <w:r>
+        <w:t>it</w:t>
+      </w:r>
+      <w:proofErr w:type="spellEnd"/>
+      <w:r>
+        <w:t xml:space="preserve"> works in </w:t>
+      </w:r>
+      <w:proofErr w:type="spellStart"/>
+      <w:r>
+        <w:t>almost</w:t>
+      </w:r>
+      <w:proofErr w:type="spellEnd"/>
+      <w:r>
+        <w:t xml:space="preserve"> </w:t>
+      </w:r>
+      <w:proofErr w:type="spellStart"/>
+      <w:r>
+        <w:t>all</w:t>
+      </w:r>
+      <w:proofErr w:type="spellEnd"/>
+      <w:r>
+        <w:t xml:space="preserve"> </w:t>
+      </w:r>
+      <w:proofErr w:type="spellStart"/>
+      <w:r>
+        <w:t>real</w:t>
+      </w:r>
+      <w:proofErr w:type="spellEnd"/>
+      <w:r>
+        <w:t xml:space="preserve"> </w:t>
+      </w:r>
+      <w:proofErr w:type="spellStart"/>
+      <w:r>
+        <w:t>applications</w:t>
+      </w:r>
+      <w:proofErr w:type="spellEnd"/>
+      <w:r>
+        <w:t xml:space="preserve">. </w:t>
+      </w:r>
+      <w:r>
+        <w:t xml:space="preserve">The firmware chain </w:t>
+      </w:r>
+      <w:proofErr w:type="spellStart"/>
+      <w:r>
+        <w:t>has</w:t>
+      </w:r>
+      <w:proofErr w:type="spellEnd"/>
+      <w:r>
+        <w:t xml:space="preserve">: a Trigger Derivative </w:t>
+      </w:r>
+      <w:proofErr w:type="spellStart"/>
+      <w:r>
+        <w:t>block</w:t>
+      </w:r>
+      <w:proofErr w:type="spellEnd"/>
+      <w:r>
+        <w:t xml:space="preserve"> </w:t>
+      </w:r>
+      <w:proofErr w:type="spellStart"/>
+      <w:r>
+        <w:t>that</w:t>
+      </w:r>
+      <w:proofErr w:type="spellEnd"/>
+      <w:r>
+        <w:t xml:space="preserve"> makes the derivative of the </w:t>
+      </w:r>
+      <w:proofErr w:type="spellStart"/>
+      <w:r>
+        <w:t>signal</w:t>
+      </w:r>
+      <w:proofErr w:type="spellEnd"/>
+      <w:r>
+        <w:t xml:space="preserve"> for the trigger, a Baseline </w:t>
+      </w:r>
+      <w:proofErr w:type="spellStart"/>
+      <w:r>
+        <w:t>Restorer</w:t>
+      </w:r>
+      <w:proofErr w:type="spellEnd"/>
+      <w:r>
+        <w:t xml:space="preserve">, a separate </w:t>
+      </w:r>
+      <w:r>
+        <w:t xml:space="preserve">chain </w:t>
+      </w:r>
+      <w:r>
+        <w:t xml:space="preserve">to </w:t>
+      </w:r>
+      <w:proofErr w:type="spellStart"/>
+      <w:r>
+        <w:t>find</w:t>
+      </w:r>
+      <w:proofErr w:type="spellEnd"/>
+      <w:r>
+        <w:t xml:space="preserve"> the </w:t>
+      </w:r>
+      <w:proofErr w:type="spellStart"/>
+      <w:r>
+        <w:t>peak</w:t>
+      </w:r>
+      <w:proofErr w:type="spellEnd"/>
+      <w:r>
+        <w:t xml:space="preserve"> </w:t>
+      </w:r>
+      <w:proofErr w:type="spellStart"/>
+      <w:r>
+        <w:t>amplitude</w:t>
+      </w:r>
+      <w:proofErr w:type="spellEnd"/>
+      <w:r>
+        <w:t xml:space="preserve">, a Delay </w:t>
+      </w:r>
+      <w:proofErr w:type="spellStart"/>
+      <w:r>
+        <w:t>Programmable</w:t>
+      </w:r>
+      <w:proofErr w:type="spellEnd"/>
+      <w:r>
+        <w:t xml:space="preserve"> </w:t>
+      </w:r>
+      <w:proofErr w:type="spellStart"/>
+      <w:r>
+        <w:t>block</w:t>
+      </w:r>
+      <w:proofErr w:type="spellEnd"/>
+      <w:r>
+        <w:t xml:space="preserve"> for time </w:t>
+      </w:r>
+      <w:proofErr w:type="spellStart"/>
+      <w:r>
+        <w:t>alignment</w:t>
+      </w:r>
+      <w:proofErr w:type="spellEnd"/>
+      <w:r>
+        <w:t xml:space="preserve">, and </w:t>
+      </w:r>
+      <w:proofErr w:type="spellStart"/>
+      <w:r>
+        <w:t>two</w:t>
+      </w:r>
+      <w:proofErr w:type="spellEnd"/>
+      <w:r>
+        <w:t xml:space="preserve"> </w:t>
+      </w:r>
+      <w:proofErr w:type="spellStart"/>
+      <w:r>
+        <w:t>independent</w:t>
+      </w:r>
+      <w:proofErr w:type="spellEnd"/>
+      <w:r>
+        <w:t xml:space="preserve"> QDC </w:t>
+      </w:r>
+      <w:proofErr w:type="spellStart"/>
+      <w:r>
+        <w:t>blocks</w:t>
+      </w:r>
+      <w:proofErr w:type="spellEnd"/>
+      <w:r>
+        <w:t xml:space="preserve"> (one for a short </w:t>
+      </w:r>
+      <w:proofErr w:type="spellStart"/>
+      <w:r>
+        <w:t>integration</w:t>
+      </w:r>
+      <w:proofErr w:type="spellEnd"/>
+      <w:r>
+        <w:t xml:space="preserve"> = </w:t>
+      </w:r>
+      <w:proofErr w:type="spellStart"/>
+      <w:r>
+        <w:t>Qshort</w:t>
+      </w:r>
+      <w:proofErr w:type="spellEnd"/>
+      <w:r>
+        <w:t xml:space="preserve">, one for a long </w:t>
+      </w:r>
+      <w:proofErr w:type="spellStart"/>
+      <w:r>
+        <w:t>integration</w:t>
+      </w:r>
+      <w:proofErr w:type="spellEnd"/>
+      <w:r>
+        <w:t xml:space="preserve"> = </w:t>
+      </w:r>
+      <w:proofErr w:type="spellStart"/>
+      <w:r>
+        <w:t>Qenergy</w:t>
+      </w:r>
+      <w:proofErr w:type="spellEnd"/>
+      <w:r>
+        <w:t>).</w:t>
+      </w:r>
+      <w:r>
+        <w:t xml:space="preserve"> </w:t>
+      </w:r>
+      <w:proofErr w:type="spellStart"/>
+      <w:r>
+        <w:t>This</w:t>
+      </w:r>
+      <w:proofErr w:type="spellEnd"/>
+      <w:r>
+        <w:t xml:space="preserve"> to </w:t>
+      </w:r>
+      <w:proofErr w:type="spellStart"/>
+      <w:r>
+        <w:t>measure</w:t>
+      </w:r>
+      <w:proofErr w:type="spellEnd"/>
+      <w:r>
+        <w:t xml:space="preserve"> the </w:t>
+      </w:r>
+      <w:proofErr w:type="spellStart"/>
+      <w:r>
+        <w:t>total</w:t>
+      </w:r>
+      <w:proofErr w:type="spellEnd"/>
+      <w:r>
+        <w:t xml:space="preserve"> energy </w:t>
+      </w:r>
+      <w:proofErr w:type="gramStart"/>
+      <w:r>
+        <w:t>in a</w:t>
+      </w:r>
+      <w:proofErr w:type="gramEnd"/>
+      <w:r>
+        <w:t xml:space="preserve"> </w:t>
+      </w:r>
+      <w:proofErr w:type="spellStart"/>
+      <w:r>
+        <w:t>better</w:t>
+      </w:r>
+      <w:proofErr w:type="spellEnd"/>
+      <w:r>
+        <w:t xml:space="preserve"> way and </w:t>
+      </w:r>
+      <w:proofErr w:type="spellStart"/>
+      <w:r>
+        <w:t>have</w:t>
+      </w:r>
+      <w:proofErr w:type="spellEnd"/>
+      <w:r>
+        <w:t xml:space="preserve"> a </w:t>
+      </w:r>
+      <w:proofErr w:type="spellStart"/>
+      <w:r>
+        <w:t>better</w:t>
+      </w:r>
+      <w:proofErr w:type="spellEnd"/>
+      <w:r>
+        <w:t xml:space="preserve"> </w:t>
+      </w:r>
+      <w:proofErr w:type="spellStart"/>
+      <w:proofErr w:type="gramStart"/>
+      <w:r>
+        <w:t>results</w:t>
+      </w:r>
+      <w:proofErr w:type="spellEnd"/>
+      <w:r>
+        <w:t xml:space="preserve"> </w:t>
+      </w:r>
+      <w:r>
+        <w:t xml:space="preserve"> The</w:t>
+      </w:r>
+      <w:proofErr w:type="gramEnd"/>
+      <w:r>
+        <w:t xml:space="preserve"> outputs go </w:t>
+      </w:r>
+      <w:proofErr w:type="spellStart"/>
+      <w:r>
+        <w:t>into</w:t>
+      </w:r>
+      <w:proofErr w:type="spellEnd"/>
+      <w:r>
+        <w:t xml:space="preserve"> a </w:t>
+      </w:r>
+      <w:proofErr w:type="spellStart"/>
+      <w:r>
+        <w:t>Wire</w:t>
+      </w:r>
+      <w:proofErr w:type="spellEnd"/>
+      <w:r>
+        <w:t xml:space="preserve"> Merge and </w:t>
+      </w:r>
+      <w:proofErr w:type="spellStart"/>
+      <w:r>
+        <w:t>then</w:t>
+      </w:r>
+      <w:proofErr w:type="spellEnd"/>
+      <w:r>
+        <w:t xml:space="preserve"> </w:t>
+      </w:r>
+      <w:proofErr w:type="spellStart"/>
+      <w:r>
+        <w:t>into</w:t>
+      </w:r>
+      <w:proofErr w:type="spellEnd"/>
+      <w:r>
+        <w:t xml:space="preserve"> a List </w:t>
+      </w:r>
+      <w:proofErr w:type="spellStart"/>
+      <w:r>
+        <w:t>block</w:t>
+      </w:r>
+      <w:proofErr w:type="spellEnd"/>
+      <w:r>
+        <w:t xml:space="preserve">, </w:t>
+      </w:r>
+      <w:proofErr w:type="spellStart"/>
+      <w:r>
+        <w:t>which</w:t>
+      </w:r>
+      <w:proofErr w:type="spellEnd"/>
+      <w:r>
+        <w:t xml:space="preserve"> makes the </w:t>
+      </w:r>
+      <w:proofErr w:type="spellStart"/>
+      <w:r>
+        <w:t>final</w:t>
+      </w:r>
+      <w:proofErr w:type="spellEnd"/>
+      <w:r>
+        <w:t xml:space="preserve"> list of events.</w:t>
+      </w:r>
+      <w:r>
+        <w:t xml:space="preserve"> (Figure 1.)</w:t>
+      </w:r>
     </w:p>
     <w:p>
       <w:pPr>
+        <w:keepNext/>
         <w:pBdr>
           <w:bottom w:val="single" w:sz="6" w:space="0" w:color="BFBFBF"/>
         </w:pBdr>
         <w:spacing w:after="160"/>
+      </w:pPr>
+      <w:r>
         <w:rPr>
           <w:lang w:val="en-US"/>
         </w:rPr>
-      </w:pPr>
+        <w:lastRenderedPageBreak/>
+        <w:drawing>
+          <wp:inline distT="0" distB="0" distL="0" distR="0" wp14:anchorId="17F9F6E7" wp14:editId="5951844C">
+            <wp:extent cx="5731510" cy="2622550"/>
+            <wp:effectExtent l="0" t="0" r="2540" b="6350"/>
+            <wp:docPr id="1224633985" name="Immagine 1"/>
+            <wp:cNvGraphicFramePr>
+              <a:graphicFrameLocks xmlns:a="http://schemas.openxmlformats.org/drawingml/2006/main" noChangeAspect="1"/>
+            </wp:cNvGraphicFramePr>
+            <a:graphic xmlns:a="http://schemas.openxmlformats.org/drawingml/2006/main">
+              <a:graphicData uri="http://schemas.openxmlformats.org/drawingml/2006/picture">
+                <pic:pic xmlns:pic="http://schemas.openxmlformats.org/drawingml/2006/picture">
+                  <pic:nvPicPr>
+                    <pic:cNvPr id="1224633985" name=""/>
+                    <pic:cNvPicPr/>
+                  </pic:nvPicPr>
+                  <pic:blipFill>
+                    <a:blip r:embed="rId7"/>
+                    <a:stretch>
+                      <a:fillRect/>
+                    </a:stretch>
+                  </pic:blipFill>
+                  <pic:spPr>
+                    <a:xfrm>
+                      <a:off x="0" y="0"/>
+                      <a:ext cx="5731510" cy="2622550"/>
+                    </a:xfrm>
+                    <a:prstGeom prst="rect">
+                      <a:avLst/>
+                    </a:prstGeom>
+                  </pic:spPr>
+                </pic:pic>
+              </a:graphicData>
+            </a:graphic>
+          </wp:inline>
+        </w:drawing>
+      </w:r>
+    </w:p>
+    <w:p>
+      <w:pPr>
+        <w:pStyle w:val="Didascalia"/>
+        <w:rPr>
+          <w:lang w:val="en-US"/>
+        </w:rPr>
+      </w:pPr>
+      <w:r>
+        <w:t xml:space="preserve">Figure </w:t>
+      </w:r>
+      <w:r>
+        <w:fldChar w:fldCharType="begin"/>
+      </w:r>
+      <w:r>
+        <w:instrText xml:space="preserve"> SEQ Figure \* ARABIC </w:instrText>
+      </w:r>
+      <w:r>
+        <w:fldChar w:fldCharType="separate"/>
+      </w:r>
+      <w:r>
+        <w:rPr>
+          <w:noProof/>
+        </w:rPr>
+        <w:t>1</w:t>
+      </w:r>
+      <w:r>
+        <w:fldChar w:fldCharType="end"/>
+      </w:r>
+      <w:r>
+        <w:t xml:space="preserve">: Block </w:t>
+      </w:r>
+      <w:proofErr w:type="spellStart"/>
+      <w:r>
+        <w:t>diagram</w:t>
+      </w:r>
+      <w:proofErr w:type="spellEnd"/>
+      <w:r>
+        <w:t xml:space="preserve"> of the firmware for the PSD</w:t>
+      </w:r>
+      <w:r>
+        <w:t xml:space="preserve"> </w:t>
+      </w:r>
+      <w:r>
+        <w:t xml:space="preserve">for the CAEN DT1260 </w:t>
+      </w:r>
+      <w:proofErr w:type="spellStart"/>
+      <w:r>
+        <w:t>digitizer</w:t>
+      </w:r>
+      <w:proofErr w:type="spellEnd"/>
+      <w:r>
+        <w:t>.</w:t>
+      </w:r>
     </w:p>
     <w:p>
       <w:pPr>
@@ -387,10 +1456,242 @@
           <w:bottom w:val="single" w:sz="6" w:space="0" w:color="BFBFBF"/>
         </w:pBdr>
         <w:spacing w:after="160"/>
-        <w:rPr>
-          <w:lang w:val="en-US"/>
-        </w:rPr>
-      </w:pPr>
+      </w:pPr>
+      <w:r>
+        <w:t xml:space="preserve">The input </w:t>
+      </w:r>
+      <w:proofErr w:type="spellStart"/>
+      <w:r>
+        <w:t>signal</w:t>
+      </w:r>
+      <w:proofErr w:type="spellEnd"/>
+      <w:r>
+        <w:t xml:space="preserve"> </w:t>
+      </w:r>
+      <w:proofErr w:type="spellStart"/>
+      <w:r>
+        <w:t>is</w:t>
+      </w:r>
+      <w:proofErr w:type="spellEnd"/>
+      <w:r>
+        <w:t xml:space="preserve"> made </w:t>
+      </w:r>
+      <w:proofErr w:type="spellStart"/>
+      <w:r>
+        <w:t>artificially</w:t>
+      </w:r>
+      <w:proofErr w:type="spellEnd"/>
+      <w:r>
+        <w:t xml:space="preserve"> with the </w:t>
+      </w:r>
+      <w:proofErr w:type="spellStart"/>
+      <w:r>
+        <w:t>Shape</w:t>
+      </w:r>
+      <w:proofErr w:type="spellEnd"/>
+      <w:r>
+        <w:t xml:space="preserve"> Generator, </w:t>
+      </w:r>
+      <w:proofErr w:type="spellStart"/>
+      <w:r>
+        <w:t>using</w:t>
+      </w:r>
+      <w:proofErr w:type="spellEnd"/>
+      <w:r>
+        <w:t xml:space="preserve"> </w:t>
+      </w:r>
+      <w:proofErr w:type="spellStart"/>
+      <w:r>
+        <w:t>exponential</w:t>
+      </w:r>
+      <w:proofErr w:type="spellEnd"/>
+      <w:r>
+        <w:t xml:space="preserve"> </w:t>
+      </w:r>
+      <w:proofErr w:type="spellStart"/>
+      <w:r>
+        <w:t>shapes</w:t>
+      </w:r>
+      <w:proofErr w:type="spellEnd"/>
+      <w:r>
+        <w:t xml:space="preserve"> with </w:t>
+      </w:r>
+      <w:proofErr w:type="spellStart"/>
+      <w:r>
+        <w:t>different</w:t>
+      </w:r>
+      <w:proofErr w:type="spellEnd"/>
+      <w:r>
+        <w:t xml:space="preserve"> </w:t>
+      </w:r>
+      <w:proofErr w:type="spellStart"/>
+      <w:r>
+        <w:t>decay</w:t>
+      </w:r>
+      <w:proofErr w:type="spellEnd"/>
+      <w:r>
+        <w:t xml:space="preserve"> </w:t>
+      </w:r>
+      <w:proofErr w:type="spellStart"/>
+      <w:r>
+        <w:t>constants</w:t>
+      </w:r>
+      <w:proofErr w:type="spellEnd"/>
+      <w:r>
+        <w:t xml:space="preserve"> (Tau) and mixing </w:t>
+      </w:r>
+      <w:proofErr w:type="spellStart"/>
+      <w:r>
+        <w:t>them</w:t>
+      </w:r>
+      <w:proofErr w:type="spellEnd"/>
+      <w:r>
+        <w:t xml:space="preserve"> with </w:t>
+      </w:r>
+      <w:proofErr w:type="spellStart"/>
+      <w:r>
+        <w:t>different</w:t>
+      </w:r>
+      <w:proofErr w:type="spellEnd"/>
+      <w:r>
+        <w:t xml:space="preserve"> </w:t>
+      </w:r>
+      <w:proofErr w:type="spellStart"/>
+      <w:r>
+        <w:t>probabilities</w:t>
+      </w:r>
+      <w:proofErr w:type="spellEnd"/>
+      <w:r>
+        <w:t xml:space="preserve">, to look like gamma and </w:t>
+      </w:r>
+      <w:proofErr w:type="spellStart"/>
+      <w:r>
+        <w:t>neutron</w:t>
+      </w:r>
+      <w:proofErr w:type="spellEnd"/>
+      <w:r>
+        <w:t xml:space="preserve"> events. </w:t>
+      </w:r>
+      <w:proofErr w:type="spellStart"/>
+      <w:r>
+        <w:t>We</w:t>
+      </w:r>
+      <w:proofErr w:type="spellEnd"/>
+      <w:r>
+        <w:t xml:space="preserve"> </w:t>
+      </w:r>
+      <w:proofErr w:type="spellStart"/>
+      <w:r>
+        <w:t>expect</w:t>
+      </w:r>
+      <w:proofErr w:type="spellEnd"/>
+      <w:r>
+        <w:t xml:space="preserve"> </w:t>
+      </w:r>
+      <w:proofErr w:type="spellStart"/>
+      <w:r>
+        <w:t>that</w:t>
+      </w:r>
+      <w:proofErr w:type="spellEnd"/>
+      <w:r>
+        <w:t xml:space="preserve"> the PSD vs Energy plot </w:t>
+      </w:r>
+      <w:proofErr w:type="spellStart"/>
+      <w:r>
+        <w:t>will</w:t>
+      </w:r>
+      <w:proofErr w:type="spellEnd"/>
+      <w:r>
+        <w:t xml:space="preserve"> show </w:t>
+      </w:r>
+      <w:proofErr w:type="spellStart"/>
+      <w:r>
+        <w:t>two</w:t>
+      </w:r>
+      <w:proofErr w:type="spellEnd"/>
+      <w:r>
+        <w:t xml:space="preserve"> </w:t>
+      </w:r>
+      <w:proofErr w:type="spellStart"/>
+      <w:r>
+        <w:t>populations</w:t>
+      </w:r>
+      <w:proofErr w:type="spellEnd"/>
+      <w:r>
+        <w:t xml:space="preserve"> </w:t>
+      </w:r>
+      <w:proofErr w:type="spellStart"/>
+      <w:r>
+        <w:t>well</w:t>
+      </w:r>
+      <w:proofErr w:type="spellEnd"/>
+      <w:r>
+        <w:t xml:space="preserve"> </w:t>
+      </w:r>
+      <w:proofErr w:type="spellStart"/>
+      <w:r>
+        <w:t>separated</w:t>
+      </w:r>
+      <w:proofErr w:type="spellEnd"/>
+      <w:r>
+        <w:t xml:space="preserve">. </w:t>
+      </w:r>
+      <w:proofErr w:type="spellStart"/>
+      <w:r>
+        <w:t>This</w:t>
+      </w:r>
+      <w:proofErr w:type="spellEnd"/>
+      <w:r>
+        <w:t xml:space="preserve"> </w:t>
+      </w:r>
+      <w:proofErr w:type="spellStart"/>
+      <w:r>
+        <w:t>separation</w:t>
+      </w:r>
+      <w:proofErr w:type="spellEnd"/>
+      <w:r>
+        <w:t xml:space="preserve"> </w:t>
+      </w:r>
+      <w:proofErr w:type="spellStart"/>
+      <w:r>
+        <w:t>is</w:t>
+      </w:r>
+      <w:proofErr w:type="spellEnd"/>
+      <w:r>
+        <w:t xml:space="preserve"> the way to check </w:t>
+      </w:r>
+      <w:proofErr w:type="spellStart"/>
+      <w:r>
+        <w:t>if</w:t>
+      </w:r>
+      <w:proofErr w:type="spellEnd"/>
+      <w:r>
+        <w:t xml:space="preserve"> the </w:t>
+      </w:r>
+      <w:proofErr w:type="spellStart"/>
+      <w:r>
+        <w:t>exercise</w:t>
+      </w:r>
+      <w:proofErr w:type="spellEnd"/>
+      <w:r>
+        <w:t xml:space="preserve"> </w:t>
+      </w:r>
+      <w:proofErr w:type="spellStart"/>
+      <w:r>
+        <w:t>was</w:t>
+      </w:r>
+      <w:proofErr w:type="spellEnd"/>
+      <w:r>
+        <w:t xml:space="preserve"> </w:t>
+      </w:r>
+      <w:proofErr w:type="spellStart"/>
+      <w:r>
+        <w:t>successful</w:t>
+      </w:r>
+      <w:proofErr w:type="spellEnd"/>
+      <w:r>
+        <w:t>.</w:t>
+      </w:r>
     </w:p>
     <w:p>
       <w:pPr>
@@ -405,34 +1706,7 @@
     </w:p>
     <w:p>
       <w:pPr>
-        <w:pBdr>
-          <w:bottom w:val="single" w:sz="6" w:space="0" w:color="BFBFBF"/>
-        </w:pBdr>
-        <w:spacing w:after="160"/>
-        <w:rPr>
-          <w:lang w:val="en-US"/>
-        </w:rPr>
-      </w:pPr>
-    </w:p>
-    <w:p>
-      <w:pPr>
-        <w:pBdr>
-          <w:bottom w:val="single" w:sz="6" w:space="0" w:color="BFBFBF"/>
-        </w:pBdr>
-        <w:spacing w:after="160"/>
-        <w:rPr>
-          <w:lang w:val="en-US"/>
-        </w:rPr>
-      </w:pPr>
-    </w:p>
-    <w:p>
-      <w:pPr>
         <w:spacing w:before="360" w:after="120"/>
-        <w:rPr>
-          <w:lang w:val="en-US"/>
-        </w:rPr>
-      </w:pPr>
-      <w:r>
         <w:rPr>
           <w:b/>
           <w:bCs/>
@@ -441,78 +1715,6 @@
           <w:szCs w:val="24"/>
           <w:lang w:val="en-US"/>
         </w:rPr>
-        <w:t>2..  Material</w:t>
-      </w:r>
-    </w:p>
-    <w:p>
-      <w:pPr>
-        <w:spacing w:after="160"/>
-        <w:rPr>
-          <w:lang w:val="en-US"/>
-        </w:rPr>
-      </w:pPr>
-      <w:r>
-        <w:rPr>
-          <w:i/>
-          <w:iCs/>
-          <w:color w:val="808080"/>
-          <w:sz w:val="20"/>
-          <w:szCs w:val="20"/>
-          <w:lang w:val="en-US"/>
-        </w:rPr>
-        <w:t>List the instruments and equipment used.</w:t>
-      </w:r>
-    </w:p>
-    <w:p>
-      <w:pPr>
-        <w:pBdr>
-          <w:bottom w:val="single" w:sz="6" w:space="0" w:color="BFBFBF"/>
-        </w:pBdr>
-        <w:spacing w:after="160"/>
-        <w:rPr>
-          <w:lang w:val="en-US"/>
-        </w:rPr>
-      </w:pPr>
-    </w:p>
-    <w:p>
-      <w:pPr>
-        <w:pBdr>
-          <w:bottom w:val="single" w:sz="6" w:space="0" w:color="BFBFBF"/>
-        </w:pBdr>
-        <w:spacing w:after="160"/>
-        <w:rPr>
-          <w:lang w:val="en-US"/>
-        </w:rPr>
-      </w:pPr>
-    </w:p>
-    <w:p>
-      <w:pPr>
-        <w:pBdr>
-          <w:bottom w:val="single" w:sz="6" w:space="0" w:color="BFBFBF"/>
-        </w:pBdr>
-        <w:spacing w:after="160"/>
-        <w:rPr>
-          <w:lang w:val="en-US"/>
-        </w:rPr>
-      </w:pPr>
-    </w:p>
-    <w:p>
-      <w:pPr>
-        <w:pBdr>
-          <w:bottom w:val="single" w:sz="6" w:space="0" w:color="BFBFBF"/>
-        </w:pBdr>
-        <w:spacing w:after="160"/>
-        <w:rPr>
-          <w:lang w:val="en-US"/>
-        </w:rPr>
-      </w:pPr>
-    </w:p>
-    <w:p>
-      <w:pPr>
-        <w:spacing w:before="360" w:after="120"/>
-        <w:rPr>
-          <w:lang w:val="en-US"/>
-        </w:rPr>
       </w:pPr>
       <w:r>
         <w:rPr>
@@ -523,30 +1725,135 @@
           <w:szCs w:val="24"/>
           <w:lang w:val="en-US"/>
         </w:rPr>
-        <w:t>3..  Measurements</w:t>
+        <w:t>2..  Material</w:t>
       </w:r>
     </w:p>
     <w:p>
       <w:pPr>
-        <w:spacing w:after="160"/>
+        <w:pStyle w:val="Paragrafoelenco"/>
+        <w:numPr>
+          <w:ilvl w:val="0"/>
+          <w:numId w:val="3"/>
+        </w:numPr>
+        <w:spacing w:before="360" w:after="120"/>
         <w:rPr>
           <w:lang w:val="en-US"/>
         </w:rPr>
       </w:pPr>
       <w:r>
         <w:rPr>
-          <w:i/>
-          <w:iCs/>
-          <w:color w:val="808080"/>
-          <w:sz w:val="20"/>
-          <w:szCs w:val="20"/>
-          <w:lang w:val="en-US"/>
-        </w:rPr>
-        <w:t>Record the data you collected. Add tables or diagrams if needed.</w:t>
+          <w:rFonts w:ascii="Times New Roman" w:eastAsia="Times New Roman" w:hAnsi="Times New Roman" w:cs="Times New Roman"/>
+          <w:sz w:val="24"/>
+          <w:szCs w:val="24"/>
+        </w:rPr>
+        <w:t xml:space="preserve">CAEN DT1260 </w:t>
+      </w:r>
+      <w:proofErr w:type="spellStart"/>
+      <w:r>
+        <w:rPr>
+          <w:rFonts w:ascii="Times New Roman" w:eastAsia="Times New Roman" w:hAnsi="Times New Roman" w:cs="Times New Roman"/>
+          <w:sz w:val="24"/>
+          <w:szCs w:val="24"/>
+        </w:rPr>
+        <w:t>digitizer</w:t>
+      </w:r>
+      <w:proofErr w:type="spellEnd"/>
+      <w:r>
+        <w:rPr>
+          <w:rFonts w:ascii="Times New Roman" w:eastAsia="Times New Roman" w:hAnsi="Times New Roman" w:cs="Times New Roman"/>
+          <w:sz w:val="24"/>
+          <w:szCs w:val="24"/>
+        </w:rPr>
+        <w:t>.</w:t>
       </w:r>
     </w:p>
     <w:p>
       <w:pPr>
+        <w:pStyle w:val="Paragrafoelenco"/>
+        <w:numPr>
+          <w:ilvl w:val="0"/>
+          <w:numId w:val="3"/>
+        </w:numPr>
+        <w:rPr>
+          <w:rFonts w:ascii="Times New Roman" w:eastAsia="Times New Roman" w:hAnsi="Times New Roman" w:cs="Times New Roman"/>
+          <w:sz w:val="24"/>
+          <w:szCs w:val="24"/>
+        </w:rPr>
+      </w:pPr>
+      <w:r>
+        <w:rPr>
+          <w:rFonts w:ascii="Times New Roman" w:eastAsia="Times New Roman" w:hAnsi="Times New Roman" w:cs="Times New Roman"/>
+          <w:sz w:val="24"/>
+          <w:szCs w:val="24"/>
+        </w:rPr>
+        <w:t>CAEN DT5810 Fast Digital Detector Emulator.</w:t>
+      </w:r>
+    </w:p>
+    <w:p>
+      <w:pPr>
+        <w:pStyle w:val="Paragrafoelenco"/>
+        <w:numPr>
+          <w:ilvl w:val="0"/>
+          <w:numId w:val="3"/>
+        </w:numPr>
+        <w:rPr>
+          <w:rFonts w:ascii="Times New Roman" w:eastAsia="Times New Roman" w:hAnsi="Times New Roman" w:cs="Times New Roman"/>
+          <w:sz w:val="24"/>
+          <w:szCs w:val="24"/>
+        </w:rPr>
+      </w:pPr>
+      <w:r>
+        <w:rPr>
+          <w:rFonts w:ascii="Times New Roman" w:eastAsia="Times New Roman" w:hAnsi="Times New Roman" w:cs="Times New Roman"/>
+          <w:sz w:val="24"/>
+          <w:szCs w:val="24"/>
+        </w:rPr>
+        <w:t xml:space="preserve">Sci-Compiler graphic </w:t>
+      </w:r>
+      <w:proofErr w:type="spellStart"/>
+      <w:r>
+        <w:rPr>
+          <w:rFonts w:ascii="Times New Roman" w:eastAsia="Times New Roman" w:hAnsi="Times New Roman" w:cs="Times New Roman"/>
+          <w:sz w:val="24"/>
+          <w:szCs w:val="24"/>
+        </w:rPr>
+        <w:t>environment</w:t>
+      </w:r>
+      <w:proofErr w:type="spellEnd"/>
+      <w:r>
+        <w:rPr>
+          <w:rFonts w:ascii="Times New Roman" w:eastAsia="Times New Roman" w:hAnsi="Times New Roman" w:cs="Times New Roman"/>
+          <w:sz w:val="24"/>
+          <w:szCs w:val="24"/>
+        </w:rPr>
+        <w:t xml:space="preserve">, v. 2026.4.17.1 </w:t>
+      </w:r>
+      <w:proofErr w:type="spellStart"/>
+      <w:r>
+        <w:rPr>
+          <w:rFonts w:ascii="Times New Roman" w:eastAsia="Times New Roman" w:hAnsi="Times New Roman" w:cs="Times New Roman"/>
+          <w:sz w:val="24"/>
+          <w:szCs w:val="24"/>
+        </w:rPr>
+        <w:t>used</w:t>
+      </w:r>
+      <w:proofErr w:type="spellEnd"/>
+      <w:r>
+        <w:rPr>
+          <w:rFonts w:ascii="Times New Roman" w:eastAsia="Times New Roman" w:hAnsi="Times New Roman" w:cs="Times New Roman"/>
+          <w:sz w:val="24"/>
+          <w:szCs w:val="24"/>
+        </w:rPr>
+        <w:t xml:space="preserve"> to design and compile the FPGA firmware.</w:t>
+      </w:r>
+    </w:p>
+    <w:p>
+      <w:pPr>
+        <w:pStyle w:val="Paragrafoelenco"/>
+        <w:numPr>
+          <w:ilvl w:val="0"/>
+          <w:numId w:val="3"/>
+        </w:numPr>
         <w:pBdr>
           <w:bottom w:val="single" w:sz="6" w:space="0" w:color="BFBFBF"/>
         </w:pBdr>
@@ -555,9 +1862,76 @@
           <w:lang w:val="en-US"/>
         </w:rPr>
       </w:pPr>
+      <w:r>
+        <w:rPr>
+          <w:rFonts w:ascii="Times New Roman" w:eastAsia="Times New Roman" w:hAnsi="Times New Roman" w:cs="Times New Roman"/>
+          <w:sz w:val="24"/>
+          <w:szCs w:val="24"/>
+        </w:rPr>
+        <w:t xml:space="preserve">Control PC with Python </w:t>
+      </w:r>
+      <w:proofErr w:type="spellStart"/>
+      <w:r>
+        <w:rPr>
+          <w:rFonts w:ascii="Times New Roman" w:eastAsia="Times New Roman" w:hAnsi="Times New Roman" w:cs="Times New Roman"/>
+          <w:sz w:val="24"/>
+          <w:szCs w:val="24"/>
+        </w:rPr>
+        <w:t>acquisition</w:t>
+      </w:r>
+      <w:proofErr w:type="spellEnd"/>
+      <w:r>
+        <w:rPr>
+          <w:rFonts w:ascii="Times New Roman" w:eastAsia="Times New Roman" w:hAnsi="Times New Roman" w:cs="Times New Roman"/>
+          <w:sz w:val="24"/>
+          <w:szCs w:val="24"/>
+        </w:rPr>
+        <w:t xml:space="preserve"> software and data </w:t>
+      </w:r>
+      <w:proofErr w:type="spellStart"/>
+      <w:r>
+        <w:rPr>
+          <w:rFonts w:ascii="Times New Roman" w:eastAsia="Times New Roman" w:hAnsi="Times New Roman" w:cs="Times New Roman"/>
+          <w:sz w:val="24"/>
+          <w:szCs w:val="24"/>
+        </w:rPr>
+        <w:t>analysis</w:t>
+      </w:r>
+      <w:proofErr w:type="spellEnd"/>
+      <w:r>
+        <w:rPr>
+          <w:rFonts w:ascii="Times New Roman" w:eastAsia="Times New Roman" w:hAnsi="Times New Roman" w:cs="Times New Roman"/>
+          <w:sz w:val="24"/>
+          <w:szCs w:val="24"/>
+        </w:rPr>
+        <w:t xml:space="preserve"> </w:t>
+      </w:r>
+      <w:proofErr w:type="spellStart"/>
+      <w:r>
+        <w:rPr>
+          <w:rFonts w:ascii="Times New Roman" w:eastAsia="Times New Roman" w:hAnsi="Times New Roman" w:cs="Times New Roman"/>
+          <w:sz w:val="24"/>
+          <w:szCs w:val="24"/>
+        </w:rPr>
+        <w:t>environment</w:t>
+      </w:r>
+      <w:proofErr w:type="spellEnd"/>
+      <w:r>
+        <w:rPr>
+          <w:rFonts w:ascii="Times New Roman" w:eastAsia="Times New Roman" w:hAnsi="Times New Roman" w:cs="Times New Roman"/>
+          <w:sz w:val="24"/>
+          <w:szCs w:val="24"/>
+        </w:rPr>
+        <w:t>.</w:t>
+      </w:r>
     </w:p>
     <w:p>
       <w:pPr>
+        <w:pStyle w:val="Paragrafoelenco"/>
+        <w:numPr>
+          <w:ilvl w:val="0"/>
+          <w:numId w:val="3"/>
+        </w:numPr>
         <w:pBdr>
           <w:bottom w:val="single" w:sz="6" w:space="0" w:color="BFBFBF"/>
         </w:pBdr>
@@ -566,61 +1940,14 @@
           <w:lang w:val="en-US"/>
         </w:rPr>
       </w:pPr>
-    </w:p>
-    <w:p>
-      <w:pPr>
-        <w:pBdr>
-          <w:bottom w:val="single" w:sz="6" w:space="0" w:color="BFBFBF"/>
-        </w:pBdr>
-        <w:spacing w:after="160"/>
-        <w:rPr>
-          <w:lang w:val="en-US"/>
-        </w:rPr>
-      </w:pPr>
-    </w:p>
-    <w:p>
-      <w:pPr>
-        <w:pBdr>
-          <w:bottom w:val="single" w:sz="6" w:space="0" w:color="BFBFBF"/>
-        </w:pBdr>
-        <w:spacing w:after="160"/>
-        <w:rPr>
-          <w:lang w:val="en-US"/>
-        </w:rPr>
-      </w:pPr>
-    </w:p>
-    <w:p>
-      <w:pPr>
-        <w:pBdr>
-          <w:bottom w:val="single" w:sz="6" w:space="0" w:color="BFBFBF"/>
-        </w:pBdr>
-        <w:spacing w:after="160"/>
-        <w:rPr>
-          <w:lang w:val="en-US"/>
-        </w:rPr>
-      </w:pPr>
-    </w:p>
-    <w:p>
-      <w:pPr>
-        <w:pBdr>
-          <w:bottom w:val="single" w:sz="6" w:space="0" w:color="BFBFBF"/>
-        </w:pBdr>
-        <w:spacing w:after="160"/>
-        <w:rPr>
-          <w:lang w:val="en-US"/>
-        </w:rPr>
-      </w:pPr>
-    </w:p>
-    <w:p>
-      <w:pPr>
-        <w:pBdr>
-          <w:bottom w:val="single" w:sz="6" w:space="0" w:color="BFBFBF"/>
-        </w:pBdr>
-        <w:spacing w:after="160"/>
-        <w:rPr>
-          <w:lang w:val="en-US"/>
-        </w:rPr>
-      </w:pPr>
+      <w:r>
+        <w:rPr>
+          <w:rFonts w:ascii="Times New Roman" w:eastAsia="Times New Roman" w:hAnsi="Times New Roman" w:cs="Times New Roman"/>
+          <w:sz w:val="24"/>
+          <w:szCs w:val="24"/>
+        </w:rPr>
+        <w:t>Lemo Cable</w:t>
+      </w:r>
     </w:p>
     <w:p>
       <w:pPr>
@@ -649,26 +1976,7 @@
           <w:szCs w:val="24"/>
           <w:lang w:val="en-US"/>
         </w:rPr>
-        <w:t>4..  Data Analysis</w:t>
-      </w:r>
-    </w:p>
-    <w:p>
-      <w:pPr>
-        <w:spacing w:after="160"/>
-        <w:rPr>
-          <w:lang w:val="en-US"/>
-        </w:rPr>
-      </w:pPr>
-      <w:r>
-        <w:rPr>
-          <w:i/>
-          <w:iCs/>
-          <w:color w:val="808080"/>
-          <w:sz w:val="20"/>
-          <w:szCs w:val="20"/>
-          <w:lang w:val="en-US"/>
-        </w:rPr>
-        <w:t>Process and interpret the data. Describe any calculations, fits, or statistical methods applied.</w:t>
+        <w:t>3..  Measurements</w:t>
       </w:r>
     </w:p>
     <w:p>
@@ -681,6 +1989,488 @@
           <w:lang w:val="en-US"/>
         </w:rPr>
       </w:pPr>
+      <w:r>
+        <w:t xml:space="preserve">The firmware chain </w:t>
+      </w:r>
+      <w:proofErr w:type="spellStart"/>
+      <w:r>
+        <w:t>was</w:t>
+      </w:r>
+      <w:proofErr w:type="spellEnd"/>
+      <w:r>
+        <w:t xml:space="preserve"> </w:t>
+      </w:r>
+      <w:proofErr w:type="spellStart"/>
+      <w:r>
+        <w:t>configured</w:t>
+      </w:r>
+      <w:proofErr w:type="spellEnd"/>
+      <w:r>
+        <w:t xml:space="preserve"> with </w:t>
+      </w:r>
+      <w:proofErr w:type="spellStart"/>
+      <w:r>
+        <w:t>these</w:t>
+      </w:r>
+      <w:proofErr w:type="spellEnd"/>
+      <w:r>
+        <w:t xml:space="preserve"> </w:t>
+      </w:r>
+      <w:proofErr w:type="spellStart"/>
+      <w:r>
+        <w:t>register</w:t>
+      </w:r>
+      <w:proofErr w:type="spellEnd"/>
+      <w:r>
+        <w:t xml:space="preserve"> </w:t>
+      </w:r>
+      <w:proofErr w:type="spellStart"/>
+      <w:r>
+        <w:t>parameters</w:t>
+      </w:r>
+      <w:proofErr w:type="spellEnd"/>
+      <w:r>
+        <w:t xml:space="preserve">: THRESHOLD = 45, M_LENGTH = 8, BL_HOLD = 700, INT_Q = 300, GAIN = 500, INT_SAMPLES = 20, PRE_TRIGGER = 15, DELAY = 20. The input </w:t>
+      </w:r>
+      <w:proofErr w:type="spellStart"/>
+      <w:r>
+        <w:t>signal</w:t>
+      </w:r>
+      <w:proofErr w:type="spellEnd"/>
+      <w:r>
+        <w:t xml:space="preserve"> </w:t>
+      </w:r>
+      <w:proofErr w:type="spellStart"/>
+      <w:r>
+        <w:t>was</w:t>
+      </w:r>
+      <w:proofErr w:type="spellEnd"/>
+      <w:r>
+        <w:t xml:space="preserve"> </w:t>
+      </w:r>
+      <w:proofErr w:type="spellStart"/>
+      <w:r>
+        <w:t>using</w:t>
+      </w:r>
+      <w:proofErr w:type="spellEnd"/>
+      <w:r>
+        <w:t xml:space="preserve"> </w:t>
+      </w:r>
+      <w:proofErr w:type="spellStart"/>
+      <w:r>
+        <w:t>Exponential</w:t>
+      </w:r>
+      <w:proofErr w:type="spellEnd"/>
+      <w:r>
+        <w:t xml:space="preserve"> </w:t>
+      </w:r>
+      <w:proofErr w:type="spellStart"/>
+      <w:r>
+        <w:t>shapes</w:t>
+      </w:r>
+      <w:proofErr w:type="spellEnd"/>
+      <w:r>
+        <w:t xml:space="preserve"> with </w:t>
+      </w:r>
+      <w:proofErr w:type="spellStart"/>
+      <w:r>
+        <w:t>parameters</w:t>
+      </w:r>
+      <w:proofErr w:type="spellEnd"/>
+      <w:r>
+        <w:t xml:space="preserve"> Offset, </w:t>
+      </w:r>
+      <w:proofErr w:type="spellStart"/>
+      <w:r>
+        <w:t>Length</w:t>
+      </w:r>
+      <w:proofErr w:type="spellEnd"/>
+      <w:r>
+        <w:t xml:space="preserve">, </w:t>
+      </w:r>
+      <w:proofErr w:type="spellStart"/>
+      <w:r>
+        <w:t>Amplitude</w:t>
+      </w:r>
+      <w:proofErr w:type="spellEnd"/>
+      <w:r>
+        <w:t xml:space="preserve"> and Tau (one </w:t>
+      </w:r>
+      <w:proofErr w:type="spellStart"/>
+      <w:r>
+        <w:t>example</w:t>
+      </w:r>
+      <w:proofErr w:type="spellEnd"/>
+      <w:r>
+        <w:t xml:space="preserve"> </w:t>
+      </w:r>
+      <w:proofErr w:type="spellStart"/>
+      <w:r>
+        <w:t>we</w:t>
+      </w:r>
+      <w:proofErr w:type="spellEnd"/>
+      <w:r>
+        <w:t xml:space="preserve"> </w:t>
+      </w:r>
+      <w:proofErr w:type="spellStart"/>
+      <w:r>
+        <w:t>saw</w:t>
+      </w:r>
+      <w:proofErr w:type="spellEnd"/>
+      <w:r>
+        <w:t xml:space="preserve">: Offset 100 sample / 0.1 µs, </w:t>
+      </w:r>
+      <w:proofErr w:type="spellStart"/>
+      <w:r>
+        <w:t>Length</w:t>
+      </w:r>
+      <w:proofErr w:type="spellEnd"/>
+      <w:r>
+        <w:t xml:space="preserve"> 1000 sample / 1 µs, </w:t>
+      </w:r>
+      <w:proofErr w:type="spellStart"/>
+      <w:r>
+        <w:t>Amplitude</w:t>
+      </w:r>
+      <w:proofErr w:type="spellEnd"/>
+      <w:r>
+        <w:t xml:space="preserve"> 32767 LSB / 3.9178 V, Tau 1 µs). For </w:t>
+      </w:r>
+      <w:proofErr w:type="spellStart"/>
+      <w:r>
+        <w:t>every</w:t>
+      </w:r>
+      <w:proofErr w:type="spellEnd"/>
+      <w:r>
+        <w:t xml:space="preserve"> </w:t>
+      </w:r>
+      <w:proofErr w:type="spellStart"/>
+      <w:r>
+        <w:t>synthetic</w:t>
+      </w:r>
+      <w:proofErr w:type="spellEnd"/>
+      <w:r>
+        <w:t xml:space="preserve"> </w:t>
+      </w:r>
+      <w:proofErr w:type="spellStart"/>
+      <w:r>
+        <w:t>pulse</w:t>
+      </w:r>
+      <w:proofErr w:type="spellEnd"/>
+      <w:r>
+        <w:t xml:space="preserve">, the </w:t>
+      </w:r>
+      <w:proofErr w:type="spellStart"/>
+      <w:r>
+        <w:t>two</w:t>
+      </w:r>
+      <w:proofErr w:type="spellEnd"/>
+      <w:r>
+        <w:t xml:space="preserve"> QDC </w:t>
+      </w:r>
+      <w:proofErr w:type="spellStart"/>
+      <w:r>
+        <w:t>blocks</w:t>
+      </w:r>
+      <w:proofErr w:type="spellEnd"/>
+      <w:r>
+        <w:t xml:space="preserve"> compute </w:t>
+      </w:r>
+      <w:proofErr w:type="spellStart"/>
+      <w:r>
+        <w:t>Qshort</w:t>
+      </w:r>
+      <w:proofErr w:type="spellEnd"/>
+      <w:r>
+        <w:t xml:space="preserve"> and </w:t>
+      </w:r>
+      <w:proofErr w:type="spellStart"/>
+      <w:r>
+        <w:t>Qenergy</w:t>
+      </w:r>
+      <w:proofErr w:type="spellEnd"/>
+      <w:r>
+        <w:t xml:space="preserve">, and the Sub/Peak Detector chain </w:t>
+      </w:r>
+      <w:proofErr w:type="spellStart"/>
+      <w:r>
+        <w:t>finds</w:t>
+      </w:r>
+      <w:proofErr w:type="spellEnd"/>
+      <w:r>
+        <w:t xml:space="preserve"> the </w:t>
+      </w:r>
+      <w:proofErr w:type="spellStart"/>
+      <w:r>
+        <w:t>peak</w:t>
+      </w:r>
+      <w:proofErr w:type="spellEnd"/>
+      <w:r>
+        <w:t xml:space="preserve"> </w:t>
+      </w:r>
+      <w:proofErr w:type="spellStart"/>
+      <w:r>
+        <w:t>value</w:t>
+      </w:r>
+      <w:proofErr w:type="spellEnd"/>
+      <w:r>
+        <w:t xml:space="preserve">. The </w:t>
+      </w:r>
+      <w:proofErr w:type="spellStart"/>
+      <w:r>
+        <w:t>Wire</w:t>
+      </w:r>
+      <w:proofErr w:type="spellEnd"/>
+      <w:r>
+        <w:t xml:space="preserve"> Merge </w:t>
+      </w:r>
+      <w:proofErr w:type="spellStart"/>
+      <w:r>
+        <w:t>block</w:t>
+      </w:r>
+      <w:proofErr w:type="spellEnd"/>
+      <w:r>
+        <w:t xml:space="preserve"> puts </w:t>
+      </w:r>
+      <w:proofErr w:type="spellStart"/>
+      <w:r>
+        <w:t>these</w:t>
+      </w:r>
+      <w:proofErr w:type="spellEnd"/>
+      <w:r>
+        <w:t xml:space="preserve"> </w:t>
+      </w:r>
+      <w:proofErr w:type="spellStart"/>
+      <w:r>
+        <w:t>three</w:t>
+      </w:r>
+      <w:proofErr w:type="spellEnd"/>
+      <w:r>
+        <w:t xml:space="preserve"> </w:t>
+      </w:r>
+      <w:proofErr w:type="spellStart"/>
+      <w:r>
+        <w:t>values</w:t>
+      </w:r>
+      <w:proofErr w:type="spellEnd"/>
+      <w:r>
+        <w:t xml:space="preserve"> </w:t>
+      </w:r>
+      <w:proofErr w:type="spellStart"/>
+      <w:r>
+        <w:t>together</w:t>
+      </w:r>
+      <w:proofErr w:type="spellEnd"/>
+      <w:r>
+        <w:t xml:space="preserve">, and the List </w:t>
+      </w:r>
+      <w:proofErr w:type="spellStart"/>
+      <w:r>
+        <w:t>block</w:t>
+      </w:r>
+      <w:proofErr w:type="spellEnd"/>
+      <w:r>
+        <w:t xml:space="preserve"> makes one data </w:t>
+      </w:r>
+      <w:proofErr w:type="spellStart"/>
+      <w:r>
+        <w:t>packet</w:t>
+      </w:r>
+      <w:proofErr w:type="spellEnd"/>
+      <w:r>
+        <w:t xml:space="preserve"> for </w:t>
+      </w:r>
+      <w:proofErr w:type="spellStart"/>
+      <w:r>
+        <w:t>each</w:t>
+      </w:r>
+      <w:proofErr w:type="spellEnd"/>
+      <w:r>
+        <w:t xml:space="preserve"> event. From </w:t>
+      </w:r>
+      <w:proofErr w:type="spellStart"/>
+      <w:r>
+        <w:t>this</w:t>
+      </w:r>
+      <w:proofErr w:type="spellEnd"/>
+      <w:r>
+        <w:t xml:space="preserve"> data </w:t>
+      </w:r>
+      <w:proofErr w:type="spellStart"/>
+      <w:r>
+        <w:t>we</w:t>
+      </w:r>
+      <w:proofErr w:type="spellEnd"/>
+      <w:r>
+        <w:t xml:space="preserve"> </w:t>
+      </w:r>
+      <w:proofErr w:type="spellStart"/>
+      <w:r>
+        <w:t>get</w:t>
+      </w:r>
+      <w:proofErr w:type="spellEnd"/>
+      <w:r>
+        <w:t xml:space="preserve"> the energy (</w:t>
+      </w:r>
+      <w:proofErr w:type="spellStart"/>
+      <w:r>
+        <w:t>Qenergy</w:t>
+      </w:r>
+      <w:proofErr w:type="spellEnd"/>
+      <w:r>
+        <w:t xml:space="preserve">) and the </w:t>
+      </w:r>
+      <w:proofErr w:type="spellStart"/>
+      <w:r>
+        <w:t>discrimination</w:t>
+      </w:r>
+      <w:proofErr w:type="spellEnd"/>
+      <w:r>
+        <w:t xml:space="preserve"> </w:t>
+      </w:r>
+      <w:proofErr w:type="spellStart"/>
+      <w:r>
+        <w:t>parameter</w:t>
+      </w:r>
+      <w:proofErr w:type="spellEnd"/>
+      <w:r>
+        <w:t xml:space="preserve"> PSD = </w:t>
+      </w:r>
+      <w:proofErr w:type="spellStart"/>
+      <w:r>
+        <w:t>peak</w:t>
+      </w:r>
+      <w:proofErr w:type="spellEnd"/>
+      <w:r>
+        <w:t xml:space="preserve"> / </w:t>
+      </w:r>
+      <w:proofErr w:type="spellStart"/>
+      <w:r>
+        <w:t>Qshort</w:t>
+      </w:r>
+      <w:proofErr w:type="spellEnd"/>
+      <w:r>
+        <w:t xml:space="preserve">. </w:t>
+      </w:r>
+      <w:r>
+        <w:t>I</w:t>
+      </w:r>
+      <w:r>
+        <w:t xml:space="preserve"> </w:t>
+      </w:r>
+      <w:proofErr w:type="spellStart"/>
+      <w:r>
+        <w:t>did</w:t>
+      </w:r>
+      <w:proofErr w:type="spellEnd"/>
+      <w:r>
+        <w:t xml:space="preserve"> 2000 </w:t>
+      </w:r>
+      <w:proofErr w:type="spellStart"/>
+      <w:r>
+        <w:t>cycles</w:t>
+      </w:r>
+      <w:proofErr w:type="spellEnd"/>
+      <w:r>
+        <w:t xml:space="preserve"> of buffer reading (</w:t>
+      </w:r>
+      <w:proofErr w:type="spellStart"/>
+      <w:r>
+        <w:t>blocking</w:t>
+      </w:r>
+      <w:proofErr w:type="spellEnd"/>
+      <w:r>
+        <w:t xml:space="preserve"> mode, </w:t>
+      </w:r>
+      <w:proofErr w:type="spellStart"/>
+      <w:r>
+        <w:t>timeout</w:t>
+      </w:r>
+      <w:proofErr w:type="spellEnd"/>
+      <w:r>
+        <w:t xml:space="preserve"> 500 </w:t>
+      </w:r>
+      <w:proofErr w:type="spellStart"/>
+      <w:r>
+        <w:t>ms</w:t>
+      </w:r>
+      <w:proofErr w:type="spellEnd"/>
+      <w:r>
+        <w:t xml:space="preserve">). The data </w:t>
+      </w:r>
+      <w:proofErr w:type="spellStart"/>
+      <w:r>
+        <w:t>was</w:t>
+      </w:r>
+      <w:proofErr w:type="spellEnd"/>
+      <w:r>
+        <w:t xml:space="preserve"> </w:t>
+      </w:r>
+      <w:proofErr w:type="spellStart"/>
+      <w:r>
+        <w:t>saved</w:t>
+      </w:r>
+      <w:proofErr w:type="spellEnd"/>
+      <w:r>
+        <w:t xml:space="preserve"> in </w:t>
+      </w:r>
+      <w:r>
+        <w:t xml:space="preserve">csv file </w:t>
+      </w:r>
+      <w:r>
+        <w:t xml:space="preserve">and </w:t>
+      </w:r>
+      <w:proofErr w:type="spellStart"/>
+      <w:r>
+        <w:t>then</w:t>
+      </w:r>
+      <w:proofErr w:type="spellEnd"/>
+      <w:r>
+        <w:t xml:space="preserve"> </w:t>
+      </w:r>
+      <w:proofErr w:type="spellStart"/>
+      <w:r>
+        <w:t>loaded</w:t>
+      </w:r>
+      <w:proofErr w:type="spellEnd"/>
+      <w:r>
+        <w:t xml:space="preserve"> </w:t>
+      </w:r>
+      <w:proofErr w:type="spellStart"/>
+      <w:r>
+        <w:t>again</w:t>
+      </w:r>
+      <w:proofErr w:type="spellEnd"/>
+      <w:r>
+        <w:t xml:space="preserve"> to make the plots. Number of </w:t>
+      </w:r>
+      <w:proofErr w:type="spellStart"/>
+      <w:r>
+        <w:t>valid</w:t>
+      </w:r>
+      <w:proofErr w:type="spellEnd"/>
+      <w:r>
+        <w:t xml:space="preserve"> events </w:t>
+      </w:r>
+      <w:proofErr w:type="spellStart"/>
+      <w:r>
+        <w:t>collected</w:t>
+      </w:r>
+      <w:proofErr w:type="spellEnd"/>
+      <w:r>
+        <w:t xml:space="preserve">: </w:t>
+      </w:r>
+      <w:proofErr w:type="spellStart"/>
+      <w:r>
+        <w:t>around</w:t>
+      </w:r>
+      <w:proofErr w:type="spellEnd"/>
+      <w:r>
+        <w:t xml:space="preserve"> 10^6</w:t>
+      </w:r>
+      <w:r>
+        <w:t>.</w:t>
+      </w:r>
     </w:p>
     <w:p>
       <w:pPr>
@@ -688,83 +2478,6 @@
           <w:bottom w:val="single" w:sz="6" w:space="0" w:color="BFBFBF"/>
         </w:pBdr>
         <w:spacing w:after="160"/>
-        <w:rPr>
-          <w:lang w:val="en-US"/>
-        </w:rPr>
-      </w:pPr>
-    </w:p>
-    <w:p>
-      <w:pPr>
-        <w:pBdr>
-          <w:bottom w:val="single" w:sz="6" w:space="0" w:color="BFBFBF"/>
-        </w:pBdr>
-        <w:spacing w:after="160"/>
-        <w:rPr>
-          <w:lang w:val="en-US"/>
-        </w:rPr>
-      </w:pPr>
-    </w:p>
-    <w:p>
-      <w:pPr>
-        <w:pBdr>
-          <w:bottom w:val="single" w:sz="6" w:space="0" w:color="BFBFBF"/>
-        </w:pBdr>
-        <w:spacing w:after="160"/>
-        <w:rPr>
-          <w:lang w:val="en-US"/>
-        </w:rPr>
-      </w:pPr>
-    </w:p>
-    <w:p>
-      <w:pPr>
-        <w:pBdr>
-          <w:bottom w:val="single" w:sz="6" w:space="0" w:color="BFBFBF"/>
-        </w:pBdr>
-        <w:spacing w:after="160"/>
-        <w:rPr>
-          <w:lang w:val="en-US"/>
-        </w:rPr>
-      </w:pPr>
-    </w:p>
-    <w:p>
-      <w:pPr>
-        <w:pBdr>
-          <w:bottom w:val="single" w:sz="6" w:space="0" w:color="BFBFBF"/>
-        </w:pBdr>
-        <w:spacing w:after="160"/>
-        <w:rPr>
-          <w:lang w:val="en-US"/>
-        </w:rPr>
-      </w:pPr>
-    </w:p>
-    <w:p>
-      <w:pPr>
-        <w:pBdr>
-          <w:bottom w:val="single" w:sz="6" w:space="0" w:color="BFBFBF"/>
-        </w:pBdr>
-        <w:spacing w:after="160"/>
-        <w:rPr>
-          <w:lang w:val="en-US"/>
-        </w:rPr>
-      </w:pPr>
-    </w:p>
-    <w:p>
-      <w:pPr>
-        <w:pBdr>
-          <w:bottom w:val="single" w:sz="6" w:space="0" w:color="BFBFBF"/>
-        </w:pBdr>
-        <w:spacing w:after="160"/>
-        <w:rPr>
-          <w:lang w:val="en-US"/>
-        </w:rPr>
-      </w:pPr>
-    </w:p>
-    <w:p>
-      <w:pPr>
-        <w:pBdr>
-          <w:bottom w:val="single" w:sz="12" w:space="0" w:color="2E74B5"/>
-        </w:pBdr>
-        <w:spacing w:before="200" w:after="200"/>
         <w:rPr>
           <w:lang w:val="en-US"/>
         </w:rPr>
@@ -786,39 +2499,8 @@
           <w:szCs w:val="24"/>
           <w:lang w:val="en-US"/>
         </w:rPr>
-        <w:t>5..  Results &amp; Conclusion</w:t>
-      </w:r>
-    </w:p>
-    <w:p>
-      <w:pPr>
-        <w:spacing w:after="160"/>
-        <w:rPr>
-          <w:lang w:val="en-US"/>
-        </w:rPr>
-      </w:pPr>
-      <w:proofErr w:type="spellStart"/>
-      <w:r>
-        <w:rPr>
-          <w:i/>
-          <w:iCs/>
-          <w:color w:val="808080"/>
-          <w:sz w:val="20"/>
-          <w:szCs w:val="20"/>
-          <w:lang w:val="en-US"/>
-        </w:rPr>
-        <w:t>Summarise</w:t>
-      </w:r>
-      <w:proofErr w:type="spellEnd"/>
-      <w:r>
-        <w:rPr>
-          <w:i/>
-          <w:iCs/>
-          <w:color w:val="808080"/>
-          <w:sz w:val="20"/>
-          <w:szCs w:val="20"/>
-          <w:lang w:val="en-US"/>
-        </w:rPr>
-        <w:t xml:space="preserve"> your results. Did the experiment meet its objectives? What did you learn? Any sources of error?</w:t>
+        <w:lastRenderedPageBreak/>
+        <w:t>4..  Data Analysis</w:t>
       </w:r>
     </w:p>
     <w:p>
@@ -827,21 +2509,793 @@
           <w:bottom w:val="single" w:sz="6" w:space="0" w:color="BFBFBF"/>
         </w:pBdr>
         <w:spacing w:after="160"/>
-        <w:rPr>
-          <w:lang w:val="en-US"/>
-        </w:rPr>
-      </w:pPr>
+      </w:pPr>
+      <w:r>
+        <w:t xml:space="preserve">The energy </w:t>
+      </w:r>
+      <w:proofErr w:type="spellStart"/>
+      <w:r>
+        <w:t>spectrum</w:t>
+      </w:r>
+      <w:proofErr w:type="spellEnd"/>
+      <w:r>
+        <w:t xml:space="preserve"> shows a </w:t>
+      </w:r>
+      <w:proofErr w:type="spellStart"/>
+      <w:r>
+        <w:t>continuous</w:t>
+      </w:r>
+      <w:proofErr w:type="spellEnd"/>
+      <w:r>
+        <w:t xml:space="preserve"> background with a "step" </w:t>
+      </w:r>
+      <w:proofErr w:type="spellStart"/>
+      <w:r>
+        <w:t>structure</w:t>
+      </w:r>
+      <w:proofErr w:type="spellEnd"/>
+      <w:r>
+        <w:t xml:space="preserve"> </w:t>
+      </w:r>
+      <w:proofErr w:type="spellStart"/>
+      <w:r>
+        <w:t>between</w:t>
+      </w:r>
+      <w:proofErr w:type="spellEnd"/>
+      <w:r>
+        <w:t xml:space="preserve"> 0 and </w:t>
+      </w:r>
+      <w:proofErr w:type="spellStart"/>
+      <w:r>
+        <w:t>about</w:t>
+      </w:r>
+      <w:proofErr w:type="spellEnd"/>
+      <w:r>
+        <w:t xml:space="preserve"> 150 </w:t>
+      </w:r>
+      <w:proofErr w:type="spellStart"/>
+      <w:r>
+        <w:t>channels</w:t>
+      </w:r>
+      <w:proofErr w:type="spellEnd"/>
+      <w:r>
+        <w:t xml:space="preserve">. Over </w:t>
+      </w:r>
+      <w:proofErr w:type="spellStart"/>
+      <w:r>
+        <w:t>this</w:t>
+      </w:r>
+      <w:proofErr w:type="spellEnd"/>
+      <w:r>
+        <w:t xml:space="preserve"> background </w:t>
+      </w:r>
+      <w:proofErr w:type="spellStart"/>
+      <w:r>
+        <w:t>there</w:t>
+      </w:r>
+      <w:proofErr w:type="spellEnd"/>
+      <w:r>
+        <w:t xml:space="preserve"> are some </w:t>
+      </w:r>
+      <w:proofErr w:type="spellStart"/>
+      <w:r>
+        <w:t>narrow</w:t>
+      </w:r>
+      <w:proofErr w:type="spellEnd"/>
+      <w:r>
+        <w:t xml:space="preserve"> and </w:t>
+      </w:r>
+      <w:proofErr w:type="spellStart"/>
+      <w:r>
+        <w:t>well-resolved</w:t>
+      </w:r>
+      <w:proofErr w:type="spellEnd"/>
+      <w:r>
+        <w:t xml:space="preserve"> </w:t>
+      </w:r>
+      <w:proofErr w:type="spellStart"/>
+      <w:r>
+        <w:t>peaks</w:t>
+      </w:r>
+      <w:proofErr w:type="spellEnd"/>
+      <w:r>
+        <w:t>. The PSD vs Energy plot shows t</w:t>
+      </w:r>
+      <w:proofErr w:type="spellStart"/>
+      <w:r>
+        <w:t>wo</w:t>
+      </w:r>
+      <w:proofErr w:type="spellEnd"/>
+      <w:r>
+        <w:t xml:space="preserve"> </w:t>
+      </w:r>
+      <w:proofErr w:type="spellStart"/>
+      <w:r>
+        <w:t>bands</w:t>
+      </w:r>
+      <w:proofErr w:type="spellEnd"/>
+      <w:r>
+        <w:t xml:space="preserve"> </w:t>
+      </w:r>
+      <w:proofErr w:type="spellStart"/>
+      <w:r>
+        <w:t>well</w:t>
+      </w:r>
+      <w:proofErr w:type="spellEnd"/>
+      <w:r>
+        <w:t xml:space="preserve"> </w:t>
+      </w:r>
+      <w:proofErr w:type="spellStart"/>
+      <w:r>
+        <w:t>separated</w:t>
+      </w:r>
+      <w:proofErr w:type="spellEnd"/>
+      <w:r>
+        <w:t xml:space="preserve"> — one </w:t>
+      </w:r>
+      <w:proofErr w:type="spellStart"/>
+      <w:r>
+        <w:t>centered</w:t>
+      </w:r>
+      <w:proofErr w:type="spellEnd"/>
+      <w:r>
+        <w:t xml:space="preserve"> </w:t>
+      </w:r>
+      <w:proofErr w:type="spellStart"/>
+      <w:r>
+        <w:t>around</w:t>
+      </w:r>
+      <w:proofErr w:type="spellEnd"/>
+      <w:r>
+        <w:t xml:space="preserve"> PSD ≈ 7.5–8.0 and the </w:t>
+      </w:r>
+      <w:proofErr w:type="spellStart"/>
+      <w:r>
+        <w:t>other</w:t>
+      </w:r>
+      <w:proofErr w:type="spellEnd"/>
+      <w:r>
+        <w:t xml:space="preserve"> </w:t>
+      </w:r>
+      <w:proofErr w:type="spellStart"/>
+      <w:r>
+        <w:t>around</w:t>
+      </w:r>
+      <w:proofErr w:type="spellEnd"/>
+      <w:r>
+        <w:t xml:space="preserve"> PSD ≈ 9.0–9.7 — with a low-</w:t>
+      </w:r>
+      <w:proofErr w:type="spellStart"/>
+      <w:r>
+        <w:t>density</w:t>
+      </w:r>
+      <w:proofErr w:type="spellEnd"/>
+      <w:r>
+        <w:t xml:space="preserve"> "</w:t>
+      </w:r>
+      <w:proofErr w:type="spellStart"/>
+      <w:r>
+        <w:t>valley</w:t>
+      </w:r>
+      <w:proofErr w:type="spellEnd"/>
+      <w:r>
+        <w:t xml:space="preserve">" </w:t>
+      </w:r>
+      <w:proofErr w:type="spellStart"/>
+      <w:r>
+        <w:t>between</w:t>
+      </w:r>
+      <w:proofErr w:type="spellEnd"/>
+      <w:r>
+        <w:t xml:space="preserve"> </w:t>
+      </w:r>
+      <w:proofErr w:type="spellStart"/>
+      <w:r>
+        <w:t>them</w:t>
+      </w:r>
+      <w:proofErr w:type="spellEnd"/>
+      <w:r>
+        <w:t xml:space="preserve">, </w:t>
+      </w:r>
+      <w:proofErr w:type="spellStart"/>
+      <w:r>
+        <w:t>around</w:t>
+      </w:r>
+      <w:proofErr w:type="spellEnd"/>
+      <w:r>
+        <w:t xml:space="preserve"> PSD ≈ 8.3–8.7. </w:t>
+      </w:r>
+      <w:proofErr w:type="spellStart"/>
+      <w:r>
+        <w:t>These</w:t>
+      </w:r>
+      <w:proofErr w:type="spellEnd"/>
+      <w:r>
+        <w:t xml:space="preserve"> </w:t>
+      </w:r>
+      <w:proofErr w:type="spellStart"/>
+      <w:r>
+        <w:t>two</w:t>
+      </w:r>
+      <w:proofErr w:type="spellEnd"/>
+      <w:r>
+        <w:t xml:space="preserve"> </w:t>
+      </w:r>
+      <w:proofErr w:type="spellStart"/>
+      <w:r>
+        <w:t>bands</w:t>
+      </w:r>
+      <w:proofErr w:type="spellEnd"/>
+      <w:r>
+        <w:t xml:space="preserve"> match </w:t>
+      </w:r>
+      <w:proofErr w:type="spellStart"/>
+      <w:r>
+        <w:t>well</w:t>
+      </w:r>
+      <w:proofErr w:type="spellEnd"/>
+      <w:r>
+        <w:t xml:space="preserve"> with the </w:t>
+      </w:r>
+      <w:proofErr w:type="spellStart"/>
+      <w:r>
+        <w:t>two</w:t>
+      </w:r>
+      <w:proofErr w:type="spellEnd"/>
+      <w:r>
+        <w:t xml:space="preserve"> </w:t>
+      </w:r>
+      <w:proofErr w:type="spellStart"/>
+      <w:r>
+        <w:t>synthetic</w:t>
+      </w:r>
+      <w:proofErr w:type="spellEnd"/>
+      <w:r>
+        <w:t xml:space="preserve"> </w:t>
+      </w:r>
+      <w:proofErr w:type="spellStart"/>
+      <w:r>
+        <w:t>populations</w:t>
+      </w:r>
+      <w:proofErr w:type="spellEnd"/>
+      <w:r>
+        <w:t xml:space="preserve"> made with </w:t>
+      </w:r>
+      <w:proofErr w:type="spellStart"/>
+      <w:r>
+        <w:t>different</w:t>
+      </w:r>
+      <w:proofErr w:type="spellEnd"/>
+      <w:r>
+        <w:t xml:space="preserve"> Tau (</w:t>
+      </w:r>
+      <w:proofErr w:type="spellStart"/>
+      <w:r>
+        <w:t>decay</w:t>
+      </w:r>
+      <w:proofErr w:type="spellEnd"/>
+      <w:r>
+        <w:t xml:space="preserve"> </w:t>
+      </w:r>
+      <w:proofErr w:type="spellStart"/>
+      <w:r>
+        <w:t>constant</w:t>
+      </w:r>
+      <w:proofErr w:type="spellEnd"/>
+      <w:r>
+        <w:t xml:space="preserve">) </w:t>
+      </w:r>
+      <w:proofErr w:type="spellStart"/>
+      <w:r>
+        <w:t>values</w:t>
+      </w:r>
+      <w:proofErr w:type="spellEnd"/>
+      <w:r>
+        <w:t xml:space="preserve">, </w:t>
+      </w:r>
+      <w:proofErr w:type="spellStart"/>
+      <w:r>
+        <w:t>using</w:t>
+      </w:r>
+      <w:proofErr w:type="spellEnd"/>
+      <w:r>
+        <w:t xml:space="preserve"> the </w:t>
+      </w:r>
+      <w:proofErr w:type="spellStart"/>
+      <w:r>
+        <w:t>Shape</w:t>
+      </w:r>
+      <w:proofErr w:type="spellEnd"/>
+      <w:r>
+        <w:t xml:space="preserve"> Generator. </w:t>
+      </w:r>
+      <w:proofErr w:type="spellStart"/>
+      <w:r>
+        <w:t>This</w:t>
+      </w:r>
+      <w:proofErr w:type="spellEnd"/>
+      <w:r>
+        <w:t xml:space="preserve"> shows </w:t>
+      </w:r>
+      <w:proofErr w:type="spellStart"/>
+      <w:r>
+        <w:t>that</w:t>
+      </w:r>
+      <w:proofErr w:type="spellEnd"/>
+      <w:r>
+        <w:t xml:space="preserve"> the </w:t>
+      </w:r>
+      <w:proofErr w:type="spellStart"/>
+      <w:r>
+        <w:t>peak</w:t>
+      </w:r>
+      <w:proofErr w:type="spellEnd"/>
+      <w:r>
+        <w:t>/</w:t>
+      </w:r>
+      <w:proofErr w:type="spellStart"/>
+      <w:r>
+        <w:t>Qshort</w:t>
+      </w:r>
+      <w:proofErr w:type="spellEnd"/>
+      <w:r>
+        <w:t xml:space="preserve"> </w:t>
+      </w:r>
+      <w:proofErr w:type="spellStart"/>
+      <w:r>
+        <w:t>algorithm</w:t>
+      </w:r>
+      <w:proofErr w:type="spellEnd"/>
+      <w:r>
+        <w:t xml:space="preserve">, </w:t>
+      </w:r>
+      <w:proofErr w:type="spellStart"/>
+      <w:r>
+        <w:t>helped</w:t>
+      </w:r>
+      <w:proofErr w:type="spellEnd"/>
+      <w:r>
+        <w:t xml:space="preserve"> by the double </w:t>
+      </w:r>
+      <w:proofErr w:type="spellStart"/>
+      <w:r>
+        <w:t>integration</w:t>
+      </w:r>
+      <w:proofErr w:type="spellEnd"/>
+      <w:r>
+        <w:t xml:space="preserve"> (</w:t>
+      </w:r>
+      <w:proofErr w:type="spellStart"/>
+      <w:r>
+        <w:t>Qshort</w:t>
+      </w:r>
+      <w:proofErr w:type="spellEnd"/>
+      <w:r>
+        <w:t>/</w:t>
+      </w:r>
+      <w:proofErr w:type="spellStart"/>
+      <w:r>
+        <w:t>Qenergy</w:t>
+      </w:r>
+      <w:proofErr w:type="spellEnd"/>
+      <w:r>
+        <w:t xml:space="preserve">) from the </w:t>
+      </w:r>
+      <w:proofErr w:type="spellStart"/>
+      <w:r>
+        <w:t>two</w:t>
+      </w:r>
+      <w:proofErr w:type="spellEnd"/>
+      <w:r>
+        <w:t xml:space="preserve"> </w:t>
+      </w:r>
+      <w:proofErr w:type="spellStart"/>
+      <w:r>
+        <w:t>independent</w:t>
+      </w:r>
+      <w:proofErr w:type="spellEnd"/>
+      <w:r>
+        <w:t xml:space="preserve"> QDC </w:t>
+      </w:r>
+      <w:proofErr w:type="spellStart"/>
+      <w:r>
+        <w:t>blocks</w:t>
+      </w:r>
+      <w:proofErr w:type="spellEnd"/>
+      <w:r>
+        <w:t xml:space="preserve">, can discriminate the </w:t>
+      </w:r>
+      <w:proofErr w:type="spellStart"/>
+      <w:r>
+        <w:t>two</w:t>
+      </w:r>
+      <w:proofErr w:type="spellEnd"/>
+      <w:r>
+        <w:t xml:space="preserve"> </w:t>
+      </w:r>
+      <w:proofErr w:type="spellStart"/>
+      <w:r>
+        <w:t>pulse</w:t>
+      </w:r>
+      <w:proofErr w:type="spellEnd"/>
+      <w:r>
+        <w:t xml:space="preserve"> </w:t>
+      </w:r>
+      <w:proofErr w:type="spellStart"/>
+      <w:r>
+        <w:t>shapes</w:t>
+      </w:r>
+      <w:proofErr w:type="spellEnd"/>
+      <w:r>
+        <w:t xml:space="preserve"> </w:t>
+      </w:r>
+      <w:proofErr w:type="spellStart"/>
+      <w:r>
+        <w:t>correctly</w:t>
+      </w:r>
+      <w:proofErr w:type="spellEnd"/>
+      <w:r>
+        <w:t xml:space="preserve">. </w:t>
+      </w:r>
     </w:p>
+    <w:tbl>
+      <w:tblPr>
+        <w:tblStyle w:val="Grigliatabella"/>
+        <w:tblW w:w="8920" w:type="dxa"/>
+        <w:tblBorders>
+          <w:top w:val="none" w:sz="0" w:space="0" w:color="auto"/>
+          <w:left w:val="none" w:sz="0" w:space="0" w:color="auto"/>
+          <w:bottom w:val="none" w:sz="0" w:space="0" w:color="auto"/>
+          <w:right w:val="none" w:sz="0" w:space="0" w:color="auto"/>
+          <w:insideH w:val="none" w:sz="0" w:space="0" w:color="auto"/>
+          <w:insideV w:val="none" w:sz="0" w:space="0" w:color="auto"/>
+        </w:tblBorders>
+        <w:tblLook w:val="04A0" w:firstRow="1" w:lastRow="0" w:firstColumn="1" w:lastColumn="0" w:noHBand="0" w:noVBand="1"/>
+      </w:tblPr>
+      <w:tblGrid>
+        <w:gridCol w:w="4522"/>
+        <w:gridCol w:w="4504"/>
+      </w:tblGrid>
+      <w:tr>
+        <w:trPr>
+          <w:trHeight w:val="3718"/>
+        </w:trPr>
+        <w:tc>
+          <w:tcPr>
+            <w:tcW w:w="4432" w:type="dxa"/>
+          </w:tcPr>
+          <w:p>
+            <w:pPr>
+              <w:keepNext/>
+              <w:spacing w:after="160"/>
+              <w:jc w:val="center"/>
+            </w:pPr>
+            <w:r>
+              <w:rPr>
+                <w:lang w:val="en-US"/>
+              </w:rPr>
+              <w:drawing>
+                <wp:inline distT="0" distB="0" distL="0" distR="0" wp14:anchorId="52A581D3" wp14:editId="32725857">
+                  <wp:extent cx="2876550" cy="1797764"/>
+                  <wp:effectExtent l="0" t="0" r="0" b="0"/>
+                  <wp:docPr id="1167760605" name="Immagine 1"/>
+                  <wp:cNvGraphicFramePr>
+                    <a:graphicFrameLocks xmlns:a="http://schemas.openxmlformats.org/drawingml/2006/main" noChangeAspect="1"/>
+                  </wp:cNvGraphicFramePr>
+                  <a:graphic xmlns:a="http://schemas.openxmlformats.org/drawingml/2006/main">
+                    <a:graphicData uri="http://schemas.openxmlformats.org/drawingml/2006/picture">
+                      <pic:pic xmlns:pic="http://schemas.openxmlformats.org/drawingml/2006/picture">
+                        <pic:nvPicPr>
+                          <pic:cNvPr id="1167760605" name=""/>
+                          <pic:cNvPicPr/>
+                        </pic:nvPicPr>
+                        <pic:blipFill>
+                          <a:blip r:embed="rId8"/>
+                          <a:stretch>
+                            <a:fillRect/>
+                          </a:stretch>
+                        </pic:blipFill>
+                        <pic:spPr>
+                          <a:xfrm>
+                            <a:off x="0" y="0"/>
+                            <a:ext cx="2921727" cy="1825998"/>
+                          </a:xfrm>
+                          <a:prstGeom prst="rect">
+                            <a:avLst/>
+                          </a:prstGeom>
+                        </pic:spPr>
+                      </pic:pic>
+                    </a:graphicData>
+                  </a:graphic>
+                </wp:inline>
+              </w:drawing>
+            </w:r>
+          </w:p>
+          <w:p>
+            <w:pPr>
+              <w:pStyle w:val="Didascalia"/>
+              <w:jc w:val="center"/>
+            </w:pPr>
+            <w:r>
+              <w:t xml:space="preserve">Figure </w:t>
+            </w:r>
+            <w:r>
+              <w:fldChar w:fldCharType="begin"/>
+            </w:r>
+            <w:r>
+              <w:instrText xml:space="preserve"> SEQ Figure \* ARABIC </w:instrText>
+            </w:r>
+            <w:r>
+              <w:fldChar w:fldCharType="separate"/>
+            </w:r>
+            <w:r>
+              <w:rPr>
+                <w:noProof/>
+              </w:rPr>
+              <w:t>2</w:t>
+            </w:r>
+            <w:r>
+              <w:fldChar w:fldCharType="end"/>
+            </w:r>
+            <w:r>
+              <w:t xml:space="preserve">: </w:t>
+            </w:r>
+            <w:r>
+              <w:t xml:space="preserve">Energy </w:t>
+            </w:r>
+            <w:proofErr w:type="spellStart"/>
+            <w:r>
+              <w:t>spectrum</w:t>
+            </w:r>
+            <w:proofErr w:type="spellEnd"/>
+            <w:r>
+              <w:t xml:space="preserve"> (linear scale</w:t>
+            </w:r>
+            <w:r>
+              <w:t>)</w:t>
+            </w:r>
+          </w:p>
+        </w:tc>
+        <w:tc>
+          <w:tcPr>
+            <w:tcW w:w="4488" w:type="dxa"/>
+          </w:tcPr>
+          <w:p>
+            <w:pPr>
+              <w:keepNext/>
+              <w:spacing w:after="160"/>
+              <w:jc w:val="center"/>
+            </w:pPr>
+            <w:r>
+              <w:rPr>
+                <w:lang w:val="en-US"/>
+              </w:rPr>
+              <w:drawing>
+                <wp:inline distT="0" distB="0" distL="0" distR="0" wp14:anchorId="60F4EF96" wp14:editId="6E0A7E61">
+                  <wp:extent cx="2865249" cy="1790700"/>
+                  <wp:effectExtent l="0" t="0" r="0" b="0"/>
+                  <wp:docPr id="1975448933" name="Immagine 1"/>
+                  <wp:cNvGraphicFramePr>
+                    <a:graphicFrameLocks xmlns:a="http://schemas.openxmlformats.org/drawingml/2006/main" noChangeAspect="1"/>
+                  </wp:cNvGraphicFramePr>
+                  <a:graphic xmlns:a="http://schemas.openxmlformats.org/drawingml/2006/main">
+                    <a:graphicData uri="http://schemas.openxmlformats.org/drawingml/2006/picture">
+                      <pic:pic xmlns:pic="http://schemas.openxmlformats.org/drawingml/2006/picture">
+                        <pic:nvPicPr>
+                          <pic:cNvPr id="1975448933" name=""/>
+                          <pic:cNvPicPr/>
+                        </pic:nvPicPr>
+                        <pic:blipFill>
+                          <a:blip r:embed="rId9"/>
+                          <a:stretch>
+                            <a:fillRect/>
+                          </a:stretch>
+                        </pic:blipFill>
+                        <pic:spPr>
+                          <a:xfrm>
+                            <a:off x="0" y="0"/>
+                            <a:ext cx="2929486" cy="1830846"/>
+                          </a:xfrm>
+                          <a:prstGeom prst="rect">
+                            <a:avLst/>
+                          </a:prstGeom>
+                        </pic:spPr>
+                      </pic:pic>
+                    </a:graphicData>
+                  </a:graphic>
+                </wp:inline>
+              </w:drawing>
+            </w:r>
+          </w:p>
+          <w:p>
+            <w:pPr>
+              <w:pStyle w:val="Didascalia"/>
+              <w:jc w:val="center"/>
+            </w:pPr>
+            <w:r>
+              <w:t xml:space="preserve">Figure </w:t>
+            </w:r>
+            <w:r>
+              <w:fldChar w:fldCharType="begin"/>
+            </w:r>
+            <w:r>
+              <w:instrText xml:space="preserve"> SEQ Figure \* ARABIC </w:instrText>
+            </w:r>
+            <w:r>
+              <w:fldChar w:fldCharType="separate"/>
+            </w:r>
+            <w:r>
+              <w:rPr>
+                <w:noProof/>
+              </w:rPr>
+              <w:t>3</w:t>
+            </w:r>
+            <w:r>
+              <w:fldChar w:fldCharType="end"/>
+            </w:r>
+            <w:r>
+              <w:t xml:space="preserve">: </w:t>
+            </w:r>
+            <w:r>
+              <w:t xml:space="preserve">Energy </w:t>
+            </w:r>
+            <w:proofErr w:type="spellStart"/>
+            <w:r>
+              <w:t>spectrum</w:t>
+            </w:r>
+            <w:proofErr w:type="spellEnd"/>
+            <w:r>
+              <w:t xml:space="preserve"> (log scale, y-</w:t>
+            </w:r>
+            <w:proofErr w:type="spellStart"/>
+            <w:r>
+              <w:t>axis</w:t>
+            </w:r>
+            <w:proofErr w:type="spellEnd"/>
+            <w:r>
+              <w:t>)</w:t>
+            </w:r>
+          </w:p>
+        </w:tc>
+      </w:tr>
+    </w:tbl>
     <w:p>
       <w:pPr>
         <w:pBdr>
           <w:bottom w:val="single" w:sz="6" w:space="0" w:color="BFBFBF"/>
         </w:pBdr>
         <w:spacing w:after="160"/>
-        <w:rPr>
-          <w:lang w:val="en-US"/>
-        </w:rPr>
-      </w:pPr>
+      </w:pPr>
+    </w:p>
+    <w:p>
+      <w:pPr>
+        <w:keepNext/>
+      </w:pPr>
+      <w:r>
+        <w:drawing>
+          <wp:inline distT="0" distB="0" distL="0" distR="0" wp14:anchorId="3D34144B" wp14:editId="4147B146">
+            <wp:extent cx="5731510" cy="4298950"/>
+            <wp:effectExtent l="0" t="0" r="2540" b="6350"/>
+            <wp:docPr id="838143325" name="Immagine 1"/>
+            <wp:cNvGraphicFramePr>
+              <a:graphicFrameLocks xmlns:a="http://schemas.openxmlformats.org/drawingml/2006/main" noChangeAspect="1"/>
+            </wp:cNvGraphicFramePr>
+            <a:graphic xmlns:a="http://schemas.openxmlformats.org/drawingml/2006/main">
+              <a:graphicData uri="http://schemas.openxmlformats.org/drawingml/2006/picture">
+                <pic:pic xmlns:pic="http://schemas.openxmlformats.org/drawingml/2006/picture">
+                  <pic:nvPicPr>
+                    <pic:cNvPr id="838143325" name=""/>
+                    <pic:cNvPicPr/>
+                  </pic:nvPicPr>
+                  <pic:blipFill>
+                    <a:blip r:embed="rId10"/>
+                    <a:stretch>
+                      <a:fillRect/>
+                    </a:stretch>
+                  </pic:blipFill>
+                  <pic:spPr>
+                    <a:xfrm>
+                      <a:off x="0" y="0"/>
+                      <a:ext cx="5743029" cy="4307590"/>
+                    </a:xfrm>
+                    <a:prstGeom prst="rect">
+                      <a:avLst/>
+                    </a:prstGeom>
+                  </pic:spPr>
+                </pic:pic>
+              </a:graphicData>
+            </a:graphic>
+          </wp:inline>
+        </w:drawing>
+      </w:r>
+    </w:p>
+    <w:p>
+      <w:pPr>
+        <w:pStyle w:val="Didascalia"/>
+      </w:pPr>
+      <w:r>
+        <w:t xml:space="preserve">Figure </w:t>
+      </w:r>
+      <w:r>
+        <w:fldChar w:fldCharType="begin"/>
+      </w:r>
+      <w:r>
+        <w:instrText xml:space="preserve"> SEQ Figure \* ARABIC </w:instrText>
+      </w:r>
+      <w:r>
+        <w:fldChar w:fldCharType="separate"/>
+      </w:r>
+      <w:r>
+        <w:rPr>
+          <w:noProof/>
+        </w:rPr>
+        <w:t>6</w:t>
+      </w:r>
+      <w:r>
+        <w:fldChar w:fldCharType="end"/>
+      </w:r>
+      <w:r>
+        <w:t xml:space="preserve">: </w:t>
+      </w:r>
+      <w:r>
+        <w:t xml:space="preserve">2D </w:t>
+      </w:r>
+      <w:proofErr w:type="spellStart"/>
+      <w:r>
+        <w:t>density</w:t>
+      </w:r>
+      <w:proofErr w:type="spellEnd"/>
+      <w:r>
+        <w:t xml:space="preserve"> </w:t>
+      </w:r>
+      <w:proofErr w:type="spellStart"/>
+      <w:r>
+        <w:t>map</w:t>
+      </w:r>
+      <w:proofErr w:type="spellEnd"/>
+      <w:r>
+        <w:t xml:space="preserve"> (color scale = log of </w:t>
+      </w:r>
+      <w:proofErr w:type="spellStart"/>
+      <w:r>
+        <w:t>counts</w:t>
+      </w:r>
+      <w:proofErr w:type="spellEnd"/>
+      <w:r>
+        <w:t xml:space="preserve">) of the PSD </w:t>
+      </w:r>
+      <w:proofErr w:type="spellStart"/>
+      <w:r>
+        <w:t>parameter</w:t>
+      </w:r>
+      <w:proofErr w:type="spellEnd"/>
+      <w:r>
+        <w:t xml:space="preserve"> versus energy. Two </w:t>
+      </w:r>
+      <w:proofErr w:type="spellStart"/>
+      <w:r>
+        <w:t>separated</w:t>
+      </w:r>
+      <w:proofErr w:type="spellEnd"/>
+      <w:r>
+        <w:t xml:space="preserve"> </w:t>
+      </w:r>
+      <w:proofErr w:type="spellStart"/>
+      <w:r>
+        <w:t>bands</w:t>
+      </w:r>
+      <w:proofErr w:type="spellEnd"/>
+      <w:r>
+        <w:t xml:space="preserve"> are </w:t>
+      </w:r>
+      <w:proofErr w:type="spellStart"/>
+      <w:r>
+        <w:t>visible</w:t>
+      </w:r>
+      <w:proofErr w:type="spellEnd"/>
+      <w:r>
+        <w:t>.</w:t>
+      </w:r>
     </w:p>
     <w:p>
       <w:pPr>
@@ -853,6 +3307,13 @@
           <w:lang w:val="en-US"/>
         </w:rPr>
       </w:pPr>
+      <w:r>
+        <w:rPr>
+          <w:noProof/>
+        </w:rPr>
+        <w:lastRenderedPageBreak/>
+        <w:t xml:space="preserve"> </w:t>
+      </w:r>
     </w:p>
     <w:p>
       <w:pPr>
@@ -861,6 +3322,7 @@
         </w:pBdr>
         <w:spacing w:after="160"/>
         <w:rPr>
+          <w:u w:val="single"/>
           <w:lang w:val="en-US"/>
         </w:rPr>
       </w:pPr>
@@ -868,13 +3330,431 @@
     <w:p>
       <w:pPr>
         <w:pBdr>
-          <w:bottom w:val="single" w:sz="6" w:space="0" w:color="BFBFBF"/>
+          <w:bottom w:val="single" w:sz="12" w:space="0" w:color="2E74B5"/>
         </w:pBdr>
-        <w:spacing w:after="160"/>
+        <w:spacing w:before="200" w:after="200"/>
         <w:rPr>
           <w:lang w:val="en-US"/>
         </w:rPr>
       </w:pPr>
+    </w:p>
+    <w:p>
+      <w:pPr>
+        <w:spacing w:before="360" w:after="120"/>
+        <w:rPr>
+          <w:lang w:val="en-US"/>
+        </w:rPr>
+      </w:pPr>
+      <w:r>
+        <w:rPr>
+          <w:b/>
+          <w:bCs/>
+          <w:color w:val="1F4E79"/>
+          <w:sz w:val="24"/>
+          <w:szCs w:val="24"/>
+          <w:lang w:val="en-US"/>
+        </w:rPr>
+        <w:t>5..  Results &amp; Conclusion</w:t>
+      </w:r>
+    </w:p>
+    <w:p>
+      <w:pPr>
+        <w:pStyle w:val="font-claude-response-body"/>
+      </w:pPr>
+      <w:r>
+        <w:t xml:space="preserve">The </w:t>
+      </w:r>
+      <w:proofErr w:type="spellStart"/>
+      <w:r>
+        <w:t>experiment</w:t>
+      </w:r>
+      <w:proofErr w:type="spellEnd"/>
+      <w:r>
+        <w:t xml:space="preserve"> </w:t>
+      </w:r>
+      <w:proofErr w:type="spellStart"/>
+      <w:r>
+        <w:t>reached</w:t>
+      </w:r>
+      <w:proofErr w:type="spellEnd"/>
+      <w:r>
+        <w:t xml:space="preserve"> </w:t>
+      </w:r>
+      <w:proofErr w:type="spellStart"/>
+      <w:r>
+        <w:t>its</w:t>
+      </w:r>
+      <w:proofErr w:type="spellEnd"/>
+      <w:r>
+        <w:t xml:space="preserve"> </w:t>
+      </w:r>
+      <w:proofErr w:type="spellStart"/>
+      <w:r>
+        <w:t>didactic</w:t>
+      </w:r>
+      <w:proofErr w:type="spellEnd"/>
+      <w:r>
+        <w:t xml:space="preserve"> goal </w:t>
+      </w:r>
+      <w:proofErr w:type="spellStart"/>
+      <w:r>
+        <w:t>very</w:t>
+      </w:r>
+      <w:proofErr w:type="spellEnd"/>
+      <w:r>
+        <w:t xml:space="preserve"> </w:t>
+      </w:r>
+      <w:proofErr w:type="spellStart"/>
+      <w:r>
+        <w:t>well</w:t>
+      </w:r>
+      <w:proofErr w:type="spellEnd"/>
+      <w:r>
+        <w:t xml:space="preserve">. In the </w:t>
+      </w:r>
+      <w:proofErr w:type="spellStart"/>
+      <w:r>
+        <w:t>given</w:t>
+      </w:r>
+      <w:proofErr w:type="spellEnd"/>
+      <w:r>
+        <w:t xml:space="preserve"> time</w:t>
+      </w:r>
+      <w:r>
+        <w:t xml:space="preserve"> </w:t>
+      </w:r>
+      <w:proofErr w:type="spellStart"/>
+      <w:r>
+        <w:t>we</w:t>
+      </w:r>
+      <w:proofErr w:type="spellEnd"/>
+      <w:r>
+        <w:t xml:space="preserve"> </w:t>
+      </w:r>
+      <w:proofErr w:type="spellStart"/>
+      <w:r>
+        <w:t>could</w:t>
+      </w:r>
+      <w:proofErr w:type="spellEnd"/>
+      <w:r>
+        <w:t xml:space="preserve"> design and compile</w:t>
+      </w:r>
+      <w:r>
+        <w:t xml:space="preserve"> </w:t>
+      </w:r>
+      <w:r>
+        <w:t xml:space="preserve">a complete firmware chain for PSD, </w:t>
+      </w:r>
+      <w:proofErr w:type="spellStart"/>
+      <w:r>
+        <w:t>based</w:t>
+      </w:r>
+      <w:proofErr w:type="spellEnd"/>
+      <w:r>
+        <w:t xml:space="preserve"> on the </w:t>
+      </w:r>
+      <w:proofErr w:type="spellStart"/>
+      <w:r>
+        <w:t>classic</w:t>
+      </w:r>
+      <w:proofErr w:type="spellEnd"/>
+      <w:r>
+        <w:t xml:space="preserve"> </w:t>
+      </w:r>
+      <w:proofErr w:type="spellStart"/>
+      <w:r>
+        <w:t>peak</w:t>
+      </w:r>
+      <w:proofErr w:type="spellEnd"/>
+      <w:r>
+        <w:t>/</w:t>
+      </w:r>
+      <w:proofErr w:type="spellStart"/>
+      <w:r>
+        <w:t>Qshort</w:t>
+      </w:r>
+      <w:proofErr w:type="spellEnd"/>
+      <w:r>
+        <w:t xml:space="preserve"> technique. </w:t>
+      </w:r>
+      <w:proofErr w:type="spellStart"/>
+      <w:r>
+        <w:t>We</w:t>
+      </w:r>
+      <w:proofErr w:type="spellEnd"/>
+      <w:r>
+        <w:t xml:space="preserve"> </w:t>
+      </w:r>
+      <w:proofErr w:type="spellStart"/>
+      <w:r>
+        <w:t>checked</w:t>
+      </w:r>
+      <w:proofErr w:type="spellEnd"/>
+      <w:r>
+        <w:t xml:space="preserve"> the chain on the DT1260 </w:t>
+      </w:r>
+      <w:proofErr w:type="spellStart"/>
+      <w:r>
+        <w:t>digitizer</w:t>
+      </w:r>
+      <w:proofErr w:type="spellEnd"/>
+      <w:r>
+        <w:t xml:space="preserve">, and with the Python </w:t>
+      </w:r>
+      <w:proofErr w:type="spellStart"/>
+      <w:r>
+        <w:t>analysis</w:t>
+      </w:r>
+      <w:proofErr w:type="spellEnd"/>
+      <w:r>
+        <w:t xml:space="preserve"> </w:t>
+      </w:r>
+      <w:proofErr w:type="spellStart"/>
+      <w:r>
+        <w:t>we</w:t>
+      </w:r>
+      <w:proofErr w:type="spellEnd"/>
+      <w:r>
+        <w:t xml:space="preserve"> </w:t>
+      </w:r>
+      <w:proofErr w:type="spellStart"/>
+      <w:r>
+        <w:t>showed</w:t>
+      </w:r>
+      <w:proofErr w:type="spellEnd"/>
+      <w:r>
+        <w:t xml:space="preserve"> </w:t>
+      </w:r>
+      <w:proofErr w:type="spellStart"/>
+      <w:r>
+        <w:t>that</w:t>
+      </w:r>
+      <w:proofErr w:type="spellEnd"/>
+      <w:r>
+        <w:t xml:space="preserve"> </w:t>
+      </w:r>
+      <w:proofErr w:type="spellStart"/>
+      <w:r>
+        <w:t>two</w:t>
+      </w:r>
+      <w:proofErr w:type="spellEnd"/>
+      <w:r>
+        <w:t xml:space="preserve"> </w:t>
+      </w:r>
+      <w:proofErr w:type="spellStart"/>
+      <w:r>
+        <w:t>synthetic</w:t>
+      </w:r>
+      <w:proofErr w:type="spellEnd"/>
+      <w:r>
+        <w:t xml:space="preserve"> </w:t>
+      </w:r>
+      <w:proofErr w:type="spellStart"/>
+      <w:r>
+        <w:t>populations</w:t>
+      </w:r>
+      <w:proofErr w:type="spellEnd"/>
+      <w:r>
+        <w:t xml:space="preserve">, made with </w:t>
+      </w:r>
+      <w:proofErr w:type="spellStart"/>
+      <w:r>
+        <w:t>different</w:t>
+      </w:r>
+      <w:proofErr w:type="spellEnd"/>
+      <w:r>
+        <w:t xml:space="preserve"> </w:t>
+      </w:r>
+      <w:r>
+        <w:t>tau</w:t>
+      </w:r>
+      <w:r>
+        <w:t xml:space="preserve">, are </w:t>
+      </w:r>
+      <w:proofErr w:type="spellStart"/>
+      <w:r>
+        <w:t>correctly</w:t>
+      </w:r>
+      <w:proofErr w:type="spellEnd"/>
+      <w:r>
+        <w:t xml:space="preserve"> </w:t>
+      </w:r>
+      <w:proofErr w:type="spellStart"/>
+      <w:r>
+        <w:t>separated</w:t>
+      </w:r>
+      <w:proofErr w:type="spellEnd"/>
+      <w:r>
+        <w:t xml:space="preserve"> in the PSD-Energy </w:t>
+      </w:r>
+      <w:proofErr w:type="spellStart"/>
+      <w:r>
+        <w:t>plane</w:t>
+      </w:r>
+      <w:proofErr w:type="spellEnd"/>
+      <w:r>
+        <w:t xml:space="preserve">. </w:t>
+      </w:r>
+      <w:proofErr w:type="spellStart"/>
+      <w:r>
+        <w:t>This</w:t>
+      </w:r>
+      <w:proofErr w:type="spellEnd"/>
+      <w:r>
+        <w:t xml:space="preserve"> </w:t>
+      </w:r>
+      <w:proofErr w:type="spellStart"/>
+      <w:r>
+        <w:t>confirms</w:t>
+      </w:r>
+      <w:proofErr w:type="spellEnd"/>
+      <w:r>
+        <w:t xml:space="preserve"> </w:t>
+      </w:r>
+      <w:proofErr w:type="spellStart"/>
+      <w:r>
+        <w:t>that</w:t>
+      </w:r>
+      <w:proofErr w:type="spellEnd"/>
+      <w:r>
+        <w:t xml:space="preserve">, </w:t>
+      </w:r>
+      <w:proofErr w:type="spellStart"/>
+      <w:r>
+        <w:t>even</w:t>
+      </w:r>
+      <w:proofErr w:type="spellEnd"/>
+      <w:r>
+        <w:t xml:space="preserve"> </w:t>
+      </w:r>
+      <w:proofErr w:type="spellStart"/>
+      <w:r>
+        <w:t>if</w:t>
+      </w:r>
+      <w:proofErr w:type="spellEnd"/>
+      <w:r>
+        <w:t xml:space="preserve"> </w:t>
+      </w:r>
+      <w:proofErr w:type="spellStart"/>
+      <w:r>
+        <w:t>it</w:t>
+      </w:r>
+      <w:proofErr w:type="spellEnd"/>
+      <w:r>
+        <w:t xml:space="preserve"> </w:t>
+      </w:r>
+      <w:proofErr w:type="spellStart"/>
+      <w:r>
+        <w:t>is</w:t>
+      </w:r>
+      <w:proofErr w:type="spellEnd"/>
+      <w:r>
+        <w:t xml:space="preserve"> the </w:t>
+      </w:r>
+      <w:proofErr w:type="spellStart"/>
+      <w:r>
+        <w:t>simplest</w:t>
+      </w:r>
+      <w:proofErr w:type="spellEnd"/>
+      <w:r>
+        <w:t xml:space="preserve"> PSD technique, the </w:t>
+      </w:r>
+      <w:proofErr w:type="spellStart"/>
+      <w:r>
+        <w:t>peak</w:t>
+      </w:r>
+      <w:proofErr w:type="spellEnd"/>
+      <w:r>
+        <w:t xml:space="preserve">/area ratio works </w:t>
+      </w:r>
+      <w:proofErr w:type="spellStart"/>
+      <w:r>
+        <w:t>well</w:t>
+      </w:r>
+      <w:proofErr w:type="spellEnd"/>
+      <w:r>
+        <w:t xml:space="preserve"> </w:t>
+      </w:r>
+      <w:proofErr w:type="spellStart"/>
+      <w:r>
+        <w:t>enough</w:t>
+      </w:r>
+      <w:proofErr w:type="spellEnd"/>
+      <w:r>
+        <w:t xml:space="preserve"> to be </w:t>
+      </w:r>
+      <w:proofErr w:type="spellStart"/>
+      <w:r>
+        <w:t>used</w:t>
+      </w:r>
+      <w:proofErr w:type="spellEnd"/>
+      <w:r>
+        <w:t xml:space="preserve"> in </w:t>
+      </w:r>
+      <w:proofErr w:type="spellStart"/>
+      <w:r>
+        <w:t>almost</w:t>
+      </w:r>
+      <w:proofErr w:type="spellEnd"/>
+      <w:r>
+        <w:t xml:space="preserve"> </w:t>
+      </w:r>
+      <w:proofErr w:type="spellStart"/>
+      <w:r>
+        <w:t>all</w:t>
+      </w:r>
+      <w:proofErr w:type="spellEnd"/>
+      <w:r>
+        <w:t xml:space="preserve"> </w:t>
+      </w:r>
+      <w:proofErr w:type="spellStart"/>
+      <w:r>
+        <w:t>real</w:t>
+      </w:r>
+      <w:proofErr w:type="spellEnd"/>
+      <w:r>
+        <w:t xml:space="preserve"> </w:t>
+      </w:r>
+      <w:proofErr w:type="spellStart"/>
+      <w:r>
+        <w:t>applications</w:t>
+      </w:r>
+      <w:proofErr w:type="spellEnd"/>
+      <w:r>
+        <w:t xml:space="preserve">, </w:t>
+      </w:r>
+      <w:proofErr w:type="spellStart"/>
+      <w:r>
+        <w:t>especially</w:t>
+      </w:r>
+      <w:proofErr w:type="spellEnd"/>
+      <w:r>
+        <w:t xml:space="preserve"> </w:t>
+      </w:r>
+      <w:proofErr w:type="spellStart"/>
+      <w:r>
+        <w:t>together</w:t>
+      </w:r>
+      <w:proofErr w:type="spellEnd"/>
+      <w:r>
+        <w:t xml:space="preserve"> with a double </w:t>
+      </w:r>
+      <w:proofErr w:type="spellStart"/>
+      <w:r>
+        <w:t>charge</w:t>
+      </w:r>
+      <w:proofErr w:type="spellEnd"/>
+      <w:r>
+        <w:t xml:space="preserve"> </w:t>
+      </w:r>
+      <w:proofErr w:type="spellStart"/>
+      <w:r>
+        <w:t>integration</w:t>
+      </w:r>
+      <w:proofErr w:type="spellEnd"/>
+      <w:r>
+        <w:t>.</w:t>
+      </w:r>
     </w:p>
     <w:p>
       <w:pPr>
@@ -916,25 +3796,6 @@
     </w:p>
     <w:p>
       <w:pPr>
-        <w:spacing w:after="80"/>
-        <w:rPr>
-          <w:lang w:val="en-US"/>
-        </w:rPr>
-      </w:pPr>
-      <w:r>
-        <w:rPr>
-          <w:i/>
-          <w:iCs/>
-          <w:color w:val="AAAAAA"/>
-          <w:sz w:val="18"/>
-          <w:szCs w:val="18"/>
-          <w:lang w:val="en-US"/>
-        </w:rPr>
-        <w:t>(Name, University, Country)</w:t>
-      </w:r>
-    </w:p>
-    <w:p>
-      <w:pPr>
         <w:rPr>
           <w:lang w:val="en-US"/>
         </w:rPr>
@@ -946,11 +3807,11 @@
           <w:u w:val="single"/>
           <w:lang w:val="en-US"/>
         </w:rPr>
-        <w:t>X ___________________________</w:t>
+        <w:t>Antonio Messina, INFN, Italia</w:t>
       </w:r>
     </w:p>
     <w:sectPr>
-      <w:headerReference w:type="default" r:id="rId7"/>
+      <w:headerReference w:type="default" r:id="rId11"/>
       <w:pgSz w:w="11906" w:h="16838"/>
       <w:pgMar w:top="1440" w:right="1440" w:bottom="1440" w:left="1440" w:header="708" w:footer="708" w:gutter="0"/>
       <w:cols w:space="720"/>
@@ -1017,12 +3878,6 @@
       <w:gridCol w:w="3612"/>
     </w:tblGrid>
     <w:tr>
-      <w:tblPrEx>
-        <w:tblCellMar>
-          <w:top w:w="0" w:type="dxa"/>
-          <w:bottom w:w="0" w:type="dxa"/>
-        </w:tblCellMar>
-      </w:tblPrEx>
       <w:trPr>
         <w:trHeight w:val="440"/>
       </w:trPr>
@@ -1174,6 +4029,119 @@
 <file path=word/numbering.xml><?xml version="1.0" encoding="utf-8"?>
 <w:numbering xmlns:wpc="http://schemas.microsoft.com/office/word/2010/wordprocessingCanvas" xmlns:cx="http://schemas.microsoft.com/office/drawing/2014/chartex" xmlns:cx1="http://schemas.microsoft.com/office/drawing/2015/9/8/chartex" xmlns:cx2="http://schemas.microsoft.com/office/drawing/2015/10/21/chartex" xmlns:cx3="http://schemas.microsoft.com/office/drawing/2016/5/9/chartex" xmlns:cx4="http://schemas.microsoft.com/office/drawing/2016/5/10/chartex" xmlns:cx5="http://schemas.microsoft.com/office/drawing/2016/5/11/chartex" xmlns:cx6="http://schemas.microsoft.com/office/drawing/2016/5/12/chartex" xmlns:cx7="http://schemas.microsoft.com/office/drawing/2016/5/13/chartex" xmlns:cx8="http://schemas.microsoft.com/office/drawing/2016/5/14/chartex" xmlns:mc="http://schemas.openxmlformats.org/markup-compatibility/2006" xmlns:aink="http://schemas.microsoft.com/office/drawing/2016/ink" xmlns:am3d="http://schemas.microsoft.com/office/drawing/2017/model3d" xmlns:o="urn:schemas-microsoft-com:office:office" xmlns:oel="http://schemas.microsoft.com/office/2019/extlst" xmlns:r="http://schemas.openxmlformats.org/officeDocument/2006/relationships" xmlns:m="http://schemas.openxmlformats.org/officeDocument/2006/math" xmlns:v="urn:schemas-microsoft-com:vml" xmlns:wp14="http://schemas.microsoft.com/office/word/2010/wordprocessingDrawing" xmlns:wp="http://schemas.openxmlformats.org/drawingml/2006/wordprocessingDrawing" xmlns:w10="urn:schemas-microsoft-com:office:word" xmlns:w="http://schemas.openxmlformats.org/wordprocessingml/2006/main" xmlns:w14="http://schemas.microsoft.com/office/word/2010/wordml" xmlns:w15="http://schemas.microsoft.com/office/word/2012/wordml" xmlns:w16cex="http://schemas.microsoft.com/office/word/2018/wordml/cex" xmlns:w16cid="http://schemas.microsoft.com/office/word/2016/wordml/cid" xmlns:w16="http://schemas.microsoft.com/office/word/2018/wordml" xmlns:w16du="http://schemas.microsoft.com/office/word/2023/wordml/word16du" xmlns:w16sdtdh="http://schemas.microsoft.com/office/word/2020/wordml/sdtdatahash" xmlns:w16sdtfl="http://schemas.microsoft.com/office/word/2024/wordml/sdtformatlock" xmlns:w16se="http://schemas.microsoft.com/office/word/2015/wordml/symex" xmlns:wpg="http://schemas.microsoft.com/office/word/2010/wordprocessingGroup" xmlns:wpi="http://schemas.microsoft.com/office/word/2010/wordprocessingInk" xmlns:wne="http://schemas.microsoft.com/office/word/2006/wordml" xmlns:wps="http://schemas.microsoft.com/office/word/2010/wordprocessingShape" mc:Ignorable="w14 w15 w16se w16cid w16 w16cex w16sdtdh w16sdtfl w16du wp14">
   <w:abstractNum w:abstractNumId="0" w15:restartNumberingAfterBreak="0">
+    <w:nsid w:val="10292A78"/>
+    <w:multiLevelType w:val="hybridMultilevel"/>
+    <w:tmpl w:val="F35A75F4"/>
+    <w:lvl w:ilvl="0" w:tplc="04100001">
+      <w:start w:val="1"/>
+      <w:numFmt w:val="bullet"/>
+      <w:lvlText w:val=""/>
+      <w:lvlJc w:val="left"/>
+      <w:pPr>
+        <w:ind w:left="720" w:hanging="360"/>
+      </w:pPr>
+      <w:rPr>
+        <w:rFonts w:ascii="Symbol" w:hAnsi="Symbol" w:hint="default"/>
+      </w:rPr>
+    </w:lvl>
+    <w:lvl w:ilvl="1" w:tplc="04100003" w:tentative="1">
+      <w:start w:val="1"/>
+      <w:numFmt w:val="bullet"/>
+      <w:lvlText w:val="o"/>
+      <w:lvlJc w:val="left"/>
+      <w:pPr>
+        <w:ind w:left="1440" w:hanging="360"/>
+      </w:pPr>
+      <w:rPr>
+        <w:rFonts w:ascii="Courier New" w:hAnsi="Courier New" w:cs="Courier New" w:hint="default"/>
+      </w:rPr>
+    </w:lvl>
+    <w:lvl w:ilvl="2" w:tplc="04100005" w:tentative="1">
+      <w:start w:val="1"/>
+      <w:numFmt w:val="bullet"/>
+      <w:lvlText w:val=""/>
+      <w:lvlJc w:val="left"/>
+      <w:pPr>
+        <w:ind w:left="2160" w:hanging="360"/>
+      </w:pPr>
+      <w:rPr>
+        <w:rFonts w:ascii="Wingdings" w:hAnsi="Wingdings" w:hint="default"/>
+      </w:rPr>
+    </w:lvl>
+    <w:lvl w:ilvl="3" w:tplc="04100001" w:tentative="1">
+      <w:start w:val="1"/>
+      <w:numFmt w:val="bullet"/>
+      <w:lvlText w:val=""/>
+      <w:lvlJc w:val="left"/>
+      <w:pPr>
+        <w:ind w:left="2880" w:hanging="360"/>
+      </w:pPr>
+      <w:rPr>
+        <w:rFonts w:ascii="Symbol" w:hAnsi="Symbol" w:hint="default"/>
+      </w:rPr>
+    </w:lvl>
+    <w:lvl w:ilvl="4" w:tplc="04100003" w:tentative="1">
+      <w:start w:val="1"/>
+      <w:numFmt w:val="bullet"/>
+      <w:lvlText w:val="o"/>
+      <w:lvlJc w:val="left"/>
+      <w:pPr>
+        <w:ind w:left="3600" w:hanging="360"/>
+      </w:pPr>
+      <w:rPr>
+        <w:rFonts w:ascii="Courier New" w:hAnsi="Courier New" w:cs="Courier New" w:hint="default"/>
+      </w:rPr>
+    </w:lvl>
+    <w:lvl w:ilvl="5" w:tplc="04100005" w:tentative="1">
+      <w:start w:val="1"/>
+      <w:numFmt w:val="bullet"/>
+      <w:lvlText w:val=""/>
+      <w:lvlJc w:val="left"/>
+      <w:pPr>
+        <w:ind w:left="4320" w:hanging="360"/>
+      </w:pPr>
+      <w:rPr>
+        <w:rFonts w:ascii="Wingdings" w:hAnsi="Wingdings" w:hint="default"/>
+      </w:rPr>
+    </w:lvl>
+    <w:lvl w:ilvl="6" w:tplc="04100001" w:tentative="1">
+      <w:start w:val="1"/>
+      <w:numFmt w:val="bullet"/>
+      <w:lvlText w:val=""/>
+      <w:lvlJc w:val="left"/>
+      <w:pPr>
+        <w:ind w:left="5040" w:hanging="360"/>
+      </w:pPr>
+      <w:rPr>
+        <w:rFonts w:ascii="Symbol" w:hAnsi="Symbol" w:hint="default"/>
+      </w:rPr>
+    </w:lvl>
+    <w:lvl w:ilvl="7" w:tplc="04100003" w:tentative="1">
+      <w:start w:val="1"/>
+      <w:numFmt w:val="bullet"/>
+      <w:lvlText w:val="o"/>
+      <w:lvlJc w:val="left"/>
+      <w:pPr>
+        <w:ind w:left="5760" w:hanging="360"/>
+      </w:pPr>
+      <w:rPr>
+        <w:rFonts w:ascii="Courier New" w:hAnsi="Courier New" w:cs="Courier New" w:hint="default"/>
+      </w:rPr>
+    </w:lvl>
+    <w:lvl w:ilvl="8" w:tplc="04100005" w:tentative="1">
+      <w:start w:val="1"/>
+      <w:numFmt w:val="bullet"/>
+      <w:lvlText w:val=""/>
+      <w:lvlJc w:val="left"/>
+      <w:pPr>
+        <w:ind w:left="6480" w:hanging="360"/>
+      </w:pPr>
+      <w:rPr>
+        <w:rFonts w:ascii="Wingdings" w:hAnsi="Wingdings" w:hint="default"/>
+      </w:rPr>
+    </w:lvl>
+  </w:abstractNum>
+  <w:abstractNum w:abstractNumId="1" w15:restartNumberingAfterBreak="0">
     <w:nsid w:val="206A4D0D"/>
     <w:multiLevelType w:val="hybridMultilevel"/>
     <w:tmpl w:val="412A3F02"/>
@@ -1259,11 +4227,130 @@
       </w:pPr>
     </w:lvl>
   </w:abstractNum>
+  <w:abstractNum w:abstractNumId="2" w15:restartNumberingAfterBreak="0">
+    <w:nsid w:val="23B225D2"/>
+    <w:multiLevelType w:val="hybridMultilevel"/>
+    <w:tmpl w:val="696E2392"/>
+    <w:lvl w:ilvl="0" w:tplc="04100001">
+      <w:start w:val="1"/>
+      <w:numFmt w:val="bullet"/>
+      <w:lvlText w:val=""/>
+      <w:lvlJc w:val="left"/>
+      <w:pPr>
+        <w:ind w:left="720" w:hanging="360"/>
+      </w:pPr>
+      <w:rPr>
+        <w:rFonts w:ascii="Symbol" w:hAnsi="Symbol" w:hint="default"/>
+      </w:rPr>
+    </w:lvl>
+    <w:lvl w:ilvl="1" w:tplc="04100003" w:tentative="1">
+      <w:start w:val="1"/>
+      <w:numFmt w:val="bullet"/>
+      <w:lvlText w:val="o"/>
+      <w:lvlJc w:val="left"/>
+      <w:pPr>
+        <w:ind w:left="1440" w:hanging="360"/>
+      </w:pPr>
+      <w:rPr>
+        <w:rFonts w:ascii="Courier New" w:hAnsi="Courier New" w:cs="Courier New" w:hint="default"/>
+      </w:rPr>
+    </w:lvl>
+    <w:lvl w:ilvl="2" w:tplc="04100005" w:tentative="1">
+      <w:start w:val="1"/>
+      <w:numFmt w:val="bullet"/>
+      <w:lvlText w:val=""/>
+      <w:lvlJc w:val="left"/>
+      <w:pPr>
+        <w:ind w:left="2160" w:hanging="360"/>
+      </w:pPr>
+      <w:rPr>
+        <w:rFonts w:ascii="Wingdings" w:hAnsi="Wingdings" w:hint="default"/>
+      </w:rPr>
+    </w:lvl>
+    <w:lvl w:ilvl="3" w:tplc="04100001" w:tentative="1">
+      <w:start w:val="1"/>
+      <w:numFmt w:val="bullet"/>
+      <w:lvlText w:val=""/>
+      <w:lvlJc w:val="left"/>
+      <w:pPr>
+        <w:ind w:left="2880" w:hanging="360"/>
+      </w:pPr>
+      <w:rPr>
+        <w:rFonts w:ascii="Symbol" w:hAnsi="Symbol" w:hint="default"/>
+      </w:rPr>
+    </w:lvl>
+    <w:lvl w:ilvl="4" w:tplc="04100003" w:tentative="1">
+      <w:start w:val="1"/>
+      <w:numFmt w:val="bullet"/>
+      <w:lvlText w:val="o"/>
+      <w:lvlJc w:val="left"/>
+      <w:pPr>
+        <w:ind w:left="3600" w:hanging="360"/>
+      </w:pPr>
+      <w:rPr>
+        <w:rFonts w:ascii="Courier New" w:hAnsi="Courier New" w:cs="Courier New" w:hint="default"/>
+      </w:rPr>
+    </w:lvl>
+    <w:lvl w:ilvl="5" w:tplc="04100005" w:tentative="1">
+      <w:start w:val="1"/>
+      <w:numFmt w:val="bullet"/>
+      <w:lvlText w:val=""/>
+      <w:lvlJc w:val="left"/>
+      <w:pPr>
+        <w:ind w:left="4320" w:hanging="360"/>
+      </w:pPr>
+      <w:rPr>
+        <w:rFonts w:ascii="Wingdings" w:hAnsi="Wingdings" w:hint="default"/>
+      </w:rPr>
+    </w:lvl>
+    <w:lvl w:ilvl="6" w:tplc="04100001" w:tentative="1">
+      <w:start w:val="1"/>
+      <w:numFmt w:val="bullet"/>
+      <w:lvlText w:val=""/>
+      <w:lvlJc w:val="left"/>
+      <w:pPr>
+        <w:ind w:left="5040" w:hanging="360"/>
+      </w:pPr>
+      <w:rPr>
+        <w:rFonts w:ascii="Symbol" w:hAnsi="Symbol" w:hint="default"/>
+      </w:rPr>
+    </w:lvl>
+    <w:lvl w:ilvl="7" w:tplc="04100003" w:tentative="1">
+      <w:start w:val="1"/>
+      <w:numFmt w:val="bullet"/>
+      <w:lvlText w:val="o"/>
+      <w:lvlJc w:val="left"/>
+      <w:pPr>
+        <w:ind w:left="5760" w:hanging="360"/>
+      </w:pPr>
+      <w:rPr>
+        <w:rFonts w:ascii="Courier New" w:hAnsi="Courier New" w:cs="Courier New" w:hint="default"/>
+      </w:rPr>
+    </w:lvl>
+    <w:lvl w:ilvl="8" w:tplc="04100005" w:tentative="1">
+      <w:start w:val="1"/>
+      <w:numFmt w:val="bullet"/>
+      <w:lvlText w:val=""/>
+      <w:lvlJc w:val="left"/>
+      <w:pPr>
+        <w:ind w:left="6480" w:hanging="360"/>
+      </w:pPr>
+      <w:rPr>
+        <w:rFonts w:ascii="Wingdings" w:hAnsi="Wingdings" w:hint="default"/>
+      </w:rPr>
+    </w:lvl>
+  </w:abstractNum>
   <w:num w:numId="1" w16cid:durableId="1972440797">
-    <w:abstractNumId w:val="0"/>
+    <w:abstractNumId w:val="1"/>
     <w:lvlOverride w:ilvl="0">
       <w:startOverride w:val="1"/>
     </w:lvlOverride>
+  </w:num>
+  <w:num w:numId="2" w16cid:durableId="1340112755">
+    <w:abstractNumId w:val="2"/>
+  </w:num>
+  <w:num w:numId="3" w16cid:durableId="1303727709">
+    <w:abstractNumId w:val="0"/>
   </w:num>
 </w:numbering>
 </file>
@@ -1750,7 +4837,6 @@
   <w:style w:type="character" w:default="1" w:styleId="Carpredefinitoparagrafo">
     <w:name w:val="Default Paragraph Font"/>
     <w:uiPriority w:val="1"/>
-    <w:semiHidden/>
     <w:unhideWhenUsed/>
   </w:style>
   <w:style w:type="table" w:default="1" w:styleId="Tabellanormale">
@@ -1907,6 +4993,54 @@
     <w:link w:val="Pidipagina"/>
     <w:uiPriority w:val="99"/>
     <w:rsid w:val="00964758"/>
+  </w:style>
+  <w:style w:type="paragraph" w:customStyle="1" w:styleId="font-claude-response-body">
+    <w:name w:val="font-claude-response-body"/>
+    <w:basedOn w:val="Normale"/>
+    <w:rsid w:val="009F40EB"/>
+    <w:pPr>
+      <w:spacing w:before="100" w:beforeAutospacing="1" w:after="100" w:afterAutospacing="1"/>
+    </w:pPr>
+    <w:rPr>
+      <w:rFonts w:ascii="Times New Roman" w:eastAsia="Times New Roman" w:hAnsi="Times New Roman" w:cs="Times New Roman"/>
+      <w:sz w:val="24"/>
+      <w:szCs w:val="24"/>
+    </w:rPr>
+  </w:style>
+  <w:style w:type="paragraph" w:styleId="Didascalia">
+    <w:name w:val="caption"/>
+    <w:basedOn w:val="Normale"/>
+    <w:next w:val="Normale"/>
+    <w:uiPriority w:val="35"/>
+    <w:unhideWhenUsed/>
+    <w:qFormat/>
+    <w:rsid w:val="009F40EB"/>
+    <w:pPr>
+      <w:spacing w:after="200"/>
+    </w:pPr>
+    <w:rPr>
+      <w:i/>
+      <w:iCs/>
+      <w:color w:val="0E2841" w:themeColor="text2"/>
+      <w:sz w:val="18"/>
+      <w:szCs w:val="18"/>
+    </w:rPr>
+  </w:style>
+  <w:style w:type="table" w:styleId="Grigliatabella">
+    <w:name w:val="Table Grid"/>
+    <w:basedOn w:val="Tabellanormale"/>
+    <w:uiPriority w:val="39"/>
+    <w:rsid w:val="000A5EFA"/>
+    <w:tblPr>
+      <w:tblBorders>
+        <w:top w:val="single" w:sz="4" w:space="0" w:color="auto"/>
+        <w:left w:val="single" w:sz="4" w:space="0" w:color="auto"/>
+        <w:bottom w:val="single" w:sz="4" w:space="0" w:color="auto"/>
+        <w:right w:val="single" w:sz="4" w:space="0" w:color="auto"/>
+        <w:insideH w:val="single" w:sz="4" w:space="0" w:color="auto"/>
+        <w:insideV w:val="single" w:sz="4" w:space="0" w:color="auto"/>
+      </w:tblBorders>
+    </w:tblPr>
   </w:style>
 </w:styles>
 </file>

</xml_diff>